<commit_message>
review-submit: regenerate the Word copy of the conventions file
Co-Authored-By: Claude Opus 5.5 <noreply@anthropic.com>
</commit_message>
<xml_diff>
--- a/docs/word/quy_uoc_va_so_chuan.docx
+++ b/docs/word/quy_uoc_va_so_chuan.docx
@@ -34,7 +34,7 @@
           <w:sz w:val="24"/>
           <w:szCs w:val="24"/>
         </w:rPr>
-        <w:t xml:space="preserve">Bản Word để đọc · nội dung gốc ở file docs/quy_uoc_va_so_chuan.md · tạo ngày 15/10/2026</w:t>
+        <w:t xml:space="preserve">Bản Word để đọc · nội dung gốc ở file docs/quy_uoc_va_so_chuan.md · tạo ngày 19/10/2026</w:t>
       </w:r>
     </w:p>
     <w:p>
@@ -84,7 +84,7 @@
             <w:sz w:val="24"/>
             <w:szCs w:val="24"/>
           </w:rPr>
-          <w:t xml:space="preserve">2. Bảng số chuẩn để đối chiếu (sẽ lưu thành file checks/numbers_of_record.csv khi bắt đầu làm)</w:t>
+          <w:t xml:space="preserve">2. Bảng số chuẩn để đối chiếu (đã lưu thành file checks/numbers_of_record.csv ngày 18/10)</w:t>
         </w:r>
       </w:hyperlink>
     </w:p>
@@ -103,6 +103,24 @@
             <w:szCs w:val="24"/>
           </w:rPr>
           <w:t xml:space="preserve">3. Nhật ký ngoại lệ: mỗi khoản lệch một dòng (slide 10 và 40)</w:t>
+        </w:r>
+      </w:hyperlink>
+    </w:p>
+    <w:p>
+      <w:pPr>
+        <w:spacing w:after="40"/>
+        <w:ind w:left="0"/>
+      </w:pPr>
+      <w:hyperlink w:history="1" w:anchor="muc_4">
+        <w:r>
+          <w:rPr>
+            <w:b/>
+            <w:bCs/>
+            <w:color w:val="1F3864"/>
+            <w:sz w:val="24"/>
+            <w:szCs w:val="24"/>
+          </w:rPr>
+          <w:t xml:space="preserve">4. Lịch sử thay đổi quy ước</w:t>
         </w:r>
       </w:hyperlink>
     </w:p>
@@ -148,8 +166,8 @@
         <w:tblLayout w:type="fixed"/>
       </w:tblPr>
       <w:tblGrid>
-        <w:gridCol w:w="3336"/>
-        <w:gridCol w:w="6302"/>
+        <w:gridCol w:w="3300"/>
+        <w:gridCol w:w="6338"/>
       </w:tblGrid>
       <w:tr>
         <w:trPr>
@@ -157,7 +175,7 @@
         </w:trPr>
         <w:tc>
           <w:tcPr>
-            <w:tcW w:type="dxa" w:w="3336"/>
+            <w:tcW w:type="dxa" w:w="3300"/>
             <w:tcBorders>
               <w:top w:val="single" w:color="BFC9D9" w:sz="4"/>
               <w:left w:val="single" w:color="BFC9D9" w:sz="4"/>
@@ -191,7 +209,7 @@
         </w:tc>
         <w:tc>
           <w:tcPr>
-            <w:tcW w:type="dxa" w:w="6302"/>
+            <w:tcW w:type="dxa" w:w="6338"/>
             <w:tcBorders>
               <w:top w:val="single" w:color="BFC9D9" w:sz="4"/>
               <w:left w:val="single" w:color="BFC9D9" w:sz="4"/>
@@ -230,7 +248,7 @@
         </w:trPr>
         <w:tc>
           <w:tcPr>
-            <w:tcW w:type="dxa" w:w="3336"/>
+            <w:tcW w:type="dxa" w:w="3300"/>
             <w:tcBorders>
               <w:top w:val="single" w:color="BFC9D9" w:sz="4"/>
               <w:left w:val="single" w:color="BFC9D9" w:sz="4"/>
@@ -259,7 +277,7 @@
         </w:tc>
         <w:tc>
           <w:tcPr>
-            <w:tcW w:type="dxa" w:w="6302"/>
+            <w:tcW w:type="dxa" w:w="6338"/>
             <w:tcBorders>
               <w:top w:val="single" w:color="BFC9D9" w:sz="4"/>
               <w:left w:val="single" w:color="BFC9D9" w:sz="4"/>
@@ -353,7 +371,7 @@
         </w:trPr>
         <w:tc>
           <w:tcPr>
-            <w:tcW w:type="dxa" w:w="3336"/>
+            <w:tcW w:type="dxa" w:w="3300"/>
             <w:tcBorders>
               <w:top w:val="single" w:color="BFC9D9" w:sz="4"/>
               <w:left w:val="single" w:color="BFC9D9" w:sz="4"/>
@@ -383,7 +401,7 @@
         </w:tc>
         <w:tc>
           <w:tcPr>
-            <w:tcW w:type="dxa" w:w="6302"/>
+            <w:tcW w:type="dxa" w:w="6338"/>
             <w:tcBorders>
               <w:top w:val="single" w:color="BFC9D9" w:sz="4"/>
               <w:left w:val="single" w:color="BFC9D9" w:sz="4"/>
@@ -476,7 +494,7 @@
         </w:trPr>
         <w:tc>
           <w:tcPr>
-            <w:tcW w:type="dxa" w:w="3336"/>
+            <w:tcW w:type="dxa" w:w="3300"/>
             <w:tcBorders>
               <w:top w:val="single" w:color="BFC9D9" w:sz="4"/>
               <w:left w:val="single" w:color="BFC9D9" w:sz="4"/>
@@ -505,7 +523,7 @@
         </w:tc>
         <w:tc>
           <w:tcPr>
-            <w:tcW w:type="dxa" w:w="6302"/>
+            <w:tcW w:type="dxa" w:w="6338"/>
             <w:tcBorders>
               <w:top w:val="single" w:color="BFC9D9" w:sz="4"/>
               <w:left w:val="single" w:color="BFC9D9" w:sz="4"/>
@@ -583,7 +601,7 @@
         </w:trPr>
         <w:tc>
           <w:tcPr>
-            <w:tcW w:type="dxa" w:w="3336"/>
+            <w:tcW w:type="dxa" w:w="3300"/>
             <w:tcBorders>
               <w:top w:val="single" w:color="BFC9D9" w:sz="4"/>
               <w:left w:val="single" w:color="BFC9D9" w:sz="4"/>
@@ -613,7 +631,7 @@
         </w:tc>
         <w:tc>
           <w:tcPr>
-            <w:tcW w:type="dxa" w:w="6302"/>
+            <w:tcW w:type="dxa" w:w="6338"/>
             <w:tcBorders>
               <w:top w:val="single" w:color="BFC9D9" w:sz="4"/>
               <w:left w:val="single" w:color="BFC9D9" w:sz="4"/>
@@ -692,7 +710,7 @@
         </w:trPr>
         <w:tc>
           <w:tcPr>
-            <w:tcW w:type="dxa" w:w="3336"/>
+            <w:tcW w:type="dxa" w:w="3300"/>
             <w:tcBorders>
               <w:top w:val="single" w:color="BFC9D9" w:sz="4"/>
               <w:left w:val="single" w:color="BFC9D9" w:sz="4"/>
@@ -721,7 +739,7 @@
         </w:tc>
         <w:tc>
           <w:tcPr>
-            <w:tcW w:type="dxa" w:w="6302"/>
+            <w:tcW w:type="dxa" w:w="6338"/>
             <w:tcBorders>
               <w:top w:val="single" w:color="BFC9D9" w:sz="4"/>
               <w:left w:val="single" w:color="BFC9D9" w:sz="4"/>
@@ -805,7 +823,7 @@
         </w:trPr>
         <w:tc>
           <w:tcPr>
-            <w:tcW w:type="dxa" w:w="3336"/>
+            <w:tcW w:type="dxa" w:w="3300"/>
             <w:tcBorders>
               <w:top w:val="single" w:color="BFC9D9" w:sz="4"/>
               <w:left w:val="single" w:color="BFC9D9" w:sz="4"/>
@@ -835,7 +853,7 @@
         </w:tc>
         <w:tc>
           <w:tcPr>
-            <w:tcW w:type="dxa" w:w="6302"/>
+            <w:tcW w:type="dxa" w:w="6338"/>
             <w:tcBorders>
               <w:top w:val="single" w:color="BFC9D9" w:sz="4"/>
               <w:left w:val="single" w:color="BFC9D9" w:sz="4"/>
@@ -888,7 +906,7 @@
         </w:trPr>
         <w:tc>
           <w:tcPr>
-            <w:tcW w:type="dxa" w:w="3336"/>
+            <w:tcW w:type="dxa" w:w="3300"/>
             <w:tcBorders>
               <w:top w:val="single" w:color="BFC9D9" w:sz="4"/>
               <w:left w:val="single" w:color="BFC9D9" w:sz="4"/>
@@ -917,7 +935,7 @@
         </w:tc>
         <w:tc>
           <w:tcPr>
-            <w:tcW w:type="dxa" w:w="6302"/>
+            <w:tcW w:type="dxa" w:w="6338"/>
             <w:tcBorders>
               <w:top w:val="single" w:color="BFC9D9" w:sz="4"/>
               <w:left w:val="single" w:color="BFC9D9" w:sz="4"/>
@@ -971,7 +989,7 @@
         </w:trPr>
         <w:tc>
           <w:tcPr>
-            <w:tcW w:type="dxa" w:w="3336"/>
+            <w:tcW w:type="dxa" w:w="3300"/>
             <w:tcBorders>
               <w:top w:val="single" w:color="BFC9D9" w:sz="4"/>
               <w:left w:val="single" w:color="BFC9D9" w:sz="4"/>
@@ -995,13 +1013,13 @@
               <w:rPr>
                 <w:rFonts w:ascii="Times New Roman" w:cs="Times New Roman" w:eastAsia="Times New Roman" w:hAnsi="Times New Roman"/>
               </w:rPr>
-              <w:t xml:space="preserve">Thứ tự các bước trong bảng cầu nối</w:t>
-            </w:r>
-          </w:p>
-        </w:tc>
-        <w:tc>
-          <w:tcPr>
-            <w:tcW w:type="dxa" w:w="6302"/>
+              <w:t xml:space="preserve">Kỳ đối soát</w:t>
+            </w:r>
+          </w:p>
+        </w:tc>
+        <w:tc>
+          <w:tcPr>
+            <w:tcW w:type="dxa" w:w="6338"/>
             <w:tcBorders>
               <w:top w:val="single" w:color="BFC9D9" w:sz="4"/>
               <w:left w:val="single" w:color="BFC9D9" w:sz="4"/>
@@ -1021,223 +1039,109 @@
               <w:pStyle w:val="ListParagraph"/>
               <w:numPr>
                 <w:ilvl w:val="0"/>
-                <w:numId w:val="3"/>
-              </w:numPr>
-              <w:spacing w:after="30"/>
-            </w:pPr>
-            <w:r>
-              <w:rPr>
-                <w:rFonts w:ascii="Times New Roman" w:cs="Times New Roman" w:eastAsia="Times New Roman" w:hAnsi="Times New Roman"/>
-              </w:rPr>
-              <w:t xml:space="preserve">Flash</w:t>
-            </w:r>
-          </w:p>
-          <w:p>
-            <w:pPr>
-              <w:pStyle w:val="ListParagraph"/>
-              <w:numPr>
-                <w:ilvl w:val="0"/>
-                <w:numId w:val="3"/>
-              </w:numPr>
-              <w:spacing w:after="30"/>
-            </w:pPr>
-            <w:r>
-              <w:rPr>
-                <w:rFonts w:ascii="Times New Roman" w:cs="Times New Roman" w:eastAsia="Times New Roman" w:hAnsi="Times New Roman"/>
-              </w:rPr>
-              <w:t xml:space="preserve">Chiết khấu</w:t>
-            </w:r>
-          </w:p>
-          <w:p>
-            <w:pPr>
-              <w:pStyle w:val="ListParagraph"/>
-              <w:numPr>
-                <w:ilvl w:val="0"/>
-                <w:numId w:val="3"/>
-              </w:numPr>
-              <w:spacing w:after="30"/>
-            </w:pPr>
-            <w:r>
-              <w:rPr>
-                <w:rFonts w:ascii="Times New Roman" w:cs="Times New Roman" w:eastAsia="Times New Roman" w:hAnsi="Times New Roman"/>
-              </w:rPr>
-              <w:t xml:space="preserve">Dòng POS trùng (POS – Point of Sale, bán tại cửa hàng)</w:t>
-            </w:r>
-          </w:p>
-          <w:p>
-            <w:pPr>
-              <w:pStyle w:val="ListParagraph"/>
-              <w:numPr>
-                <w:ilvl w:val="0"/>
-                <w:numId w:val="3"/>
-              </w:numPr>
-              <w:spacing w:after="30"/>
-            </w:pPr>
-            <w:r>
-              <w:rPr>
-                <w:rFonts w:ascii="Times New Roman" w:cs="Times New Roman" w:eastAsia="Times New Roman" w:hAnsi="Times New Roman"/>
-              </w:rPr>
-              <w:t xml:space="preserve">Đơn hủy</w:t>
-            </w:r>
-          </w:p>
-          <w:p>
-            <w:pPr>
-              <w:pStyle w:val="ListParagraph"/>
-              <w:numPr>
-                <w:ilvl w:val="0"/>
-                <w:numId w:val="3"/>
-              </w:numPr>
-              <w:spacing w:after="30"/>
-            </w:pPr>
-            <w:r>
-              <w:rPr>
-                <w:rFonts w:ascii="Times New Roman" w:cs="Times New Roman" w:eastAsia="Times New Roman" w:hAnsi="Times New Roman"/>
-              </w:rPr>
-              <w:t xml:space="preserve">Lệch thời điểm online</w:t>
-            </w:r>
-          </w:p>
-          <w:p>
-            <w:pPr>
-              <w:pStyle w:val="ListParagraph"/>
-              <w:numPr>
-                <w:ilvl w:val="0"/>
-                <w:numId w:val="3"/>
-              </w:numPr>
-              <w:spacing w:after="30"/>
-            </w:pPr>
-            <w:r>
-              <w:rPr>
-                <w:rFonts w:ascii="Times New Roman" w:cs="Times New Roman" w:eastAsia="Times New Roman" w:hAnsi="Times New Roman"/>
-              </w:rPr>
-              <w:t xml:space="preserve">Lệch ngày ghi sổ của cửa hàng</w:t>
-            </w:r>
-          </w:p>
-          <w:p>
-            <w:pPr>
-              <w:pStyle w:val="ListParagraph"/>
-              <w:numPr>
-                <w:ilvl w:val="0"/>
-                <w:numId w:val="3"/>
-              </w:numPr>
-              <w:spacing w:after="30"/>
-            </w:pPr>
-            <w:r>
-              <w:rPr>
-                <w:rFonts w:ascii="Times New Roman" w:cs="Times New Roman" w:eastAsia="Times New Roman" w:hAnsi="Times New Roman"/>
-              </w:rPr>
-              <w:t xml:space="preserve">Lỗi chuyển dữ liệu</w:t>
-            </w:r>
-          </w:p>
-          <w:p>
-            <w:pPr>
-              <w:pStyle w:val="ListParagraph"/>
-              <w:numPr>
-                <w:ilvl w:val="0"/>
-                <w:numId w:val="3"/>
-              </w:numPr>
-              <w:spacing w:after="30"/>
-            </w:pPr>
-            <w:r>
-              <w:rPr>
-                <w:rFonts w:ascii="Times New Roman" w:cs="Times New Roman" w:eastAsia="Times New Roman" w:hAnsi="Times New Roman"/>
-              </w:rPr>
-              <w:t xml:space="preserve">Hàng trả</w:t>
-            </w:r>
-          </w:p>
-          <w:p>
-            <w:pPr>
-              <w:pStyle w:val="ListParagraph"/>
-              <w:numPr>
-                <w:ilvl w:val="0"/>
-                <w:numId w:val="3"/>
-              </w:numPr>
-              <w:spacing w:after="30"/>
-            </w:pPr>
-            <w:r>
-              <w:rPr>
-                <w:rFonts w:ascii="Times New Roman" w:cs="Times New Roman" w:eastAsia="Times New Roman" w:hAnsi="Times New Roman"/>
-              </w:rPr>
-              <w:t xml:space="preserve">Phí vận chuyển</w:t>
-            </w:r>
-          </w:p>
-          <w:p>
-            <w:pPr>
-              <w:pStyle w:val="ListParagraph"/>
-              <w:numPr>
-                <w:ilvl w:val="0"/>
-                <w:numId w:val="3"/>
-              </w:numPr>
-              <w:spacing w:after="30"/>
-            </w:pPr>
-            <w:r>
-              <w:rPr>
-                <w:rFonts w:ascii="Times New Roman" w:cs="Times New Roman" w:eastAsia="Times New Roman" w:hAnsi="Times New Roman"/>
-              </w:rPr>
-              <w:t xml:space="preserve">Chuyển kênh MJ-RCL (chỉ có ở bảng cầu nối theo kênh)</w:t>
-            </w:r>
-          </w:p>
-          <w:p>
-            <w:pPr>
-              <w:pStyle w:val="ListParagraph"/>
-              <w:numPr>
-                <w:ilvl w:val="0"/>
-                <w:numId w:val="3"/>
-              </w:numPr>
-              <w:spacing w:after="30"/>
-            </w:pPr>
-            <w:r>
-              <w:rPr>
-                <w:rFonts w:ascii="Times New Roman" w:cs="Times New Roman" w:eastAsia="Times New Roman" w:hAnsi="Times New Roman"/>
-              </w:rPr>
-              <w:t xml:space="preserve">Tỷ giá</w:t>
-            </w:r>
-          </w:p>
-          <w:p>
-            <w:pPr>
-              <w:pStyle w:val="ListParagraph"/>
-              <w:numPr>
-                <w:ilvl w:val="0"/>
-                <w:numId w:val="3"/>
-              </w:numPr>
-              <w:spacing w:after="30"/>
-            </w:pPr>
-            <w:r>
-              <w:rPr>
-                <w:rFonts w:ascii="Times New Roman" w:cs="Times New Roman" w:eastAsia="Times New Roman" w:hAnsi="Times New Roman"/>
-              </w:rPr>
-              <w:t xml:space="preserve">Làm tròn</w:t>
-            </w:r>
-          </w:p>
-          <w:p>
-            <w:pPr>
-              <w:pStyle w:val="ListParagraph"/>
-              <w:numPr>
-                <w:ilvl w:val="0"/>
-                <w:numId w:val="3"/>
-              </w:numPr>
-              <w:spacing w:after="30"/>
-            </w:pPr>
-            <w:r>
-              <w:rPr>
-                <w:rFonts w:ascii="Times New Roman" w:cs="Times New Roman" w:eastAsia="Times New Roman" w:hAnsi="Times New Roman"/>
-              </w:rPr>
-              <w:t xml:space="preserve">Chưa giải thích</w:t>
-            </w:r>
-          </w:p>
-          <w:p>
-            <w:pPr>
-              <w:pStyle w:val="ListParagraph"/>
-              <w:numPr>
-                <w:ilvl w:val="0"/>
-                <w:numId w:val="3"/>
-              </w:numPr>
-              <w:spacing w:after="30"/>
-            </w:pPr>
-            <w:r>
-              <w:rPr>
-                <w:rFonts w:ascii="Times New Roman" w:cs="Times New Roman" w:eastAsia="Times New Roman" w:hAnsi="Times New Roman"/>
-              </w:rPr>
-              <w:t xml:space="preserve">Sổ cái</w:t>
+                <w:numId w:val="2"/>
+              </w:numPr>
+              <w:spacing w:after="30"/>
+            </w:pPr>
+            <w:r>
+              <w:rPr>
+                <w:rFonts w:ascii="Times New Roman" w:cs="Times New Roman" w:eastAsia="Times New Roman" w:hAnsi="Times New Roman"/>
+              </w:rPr>
+              <w:t xml:space="preserve">Kỳ đối soát = </w:t>
+            </w:r>
+            <w:r>
+              <w:rPr>
+                <w:rFonts w:ascii="Times New Roman" w:cs="Times New Roman" w:eastAsia="Times New Roman" w:hAnsi="Times New Roman"/>
+                <w:b/>
+                <w:bCs/>
+              </w:rPr>
+              <w:t xml:space="preserve">các tháng có trong Flash</w:t>
+            </w:r>
+            <w:r>
+              <w:rPr>
+                <w:rFonts w:ascii="Times New Roman" w:cs="Times New Roman" w:eastAsia="Times New Roman" w:hAnsi="Times New Roman"/>
+              </w:rPr>
+              <w:t xml:space="preserve">; không ghi cứng năm trong truy vấn và công thức.</w:t>
+            </w:r>
+          </w:p>
+          <w:p>
+            <w:pPr>
+              <w:pStyle w:val="ListParagraph"/>
+              <w:numPr>
+                <w:ilvl w:val="0"/>
+                <w:numId w:val="2"/>
+              </w:numPr>
+              <w:spacing w:after="30"/>
+            </w:pPr>
+            <w:r>
+              <w:rPr>
+                <w:rFonts w:ascii="Times New Roman" w:cs="Times New Roman" w:eastAsia="Times New Roman" w:hAnsi="Times New Roman"/>
+              </w:rPr>
+              <w:t xml:space="preserve">Thêm tháng mới vào Flash thì kỳ tự dài ra (đã chạy thử với tháng 01/2026, plan </w:t>
+            </w:r>
+            <w:r>
+              <w:rPr>
+                <w:rFonts w:ascii="Times New Roman" w:cs="Times New Roman" w:eastAsia="Times New Roman" w:hAnsi="Times New Roman"/>
+                <w:color w:val="9C2B2B"/>
+                <w:sz w:val="24"/>
+                <w:szCs w:val="24"/>
+                <w:shd w:fill="EEEEEE" w:color="auto" w:val="clear"/>
+              </w:rPr>
+              <w:t xml:space="preserve">refresh-test</w:t>
+            </w:r>
+            <w:r>
+              <w:rPr>
+                <w:rFonts w:ascii="Times New Roman" w:cs="Times New Roman" w:eastAsia="Times New Roman" w:hAnsi="Times New Roman"/>
+              </w:rPr>
+              <w:t xml:space="preserve">).</w:t>
+            </w:r>
+          </w:p>
+          <w:p>
+            <w:pPr>
+              <w:pStyle w:val="ListParagraph"/>
+              <w:numPr>
+                <w:ilvl w:val="0"/>
+                <w:numId w:val="2"/>
+              </w:numPr>
+              <w:spacing w:after="30"/>
+            </w:pPr>
+            <w:r>
+              <w:rPr>
+                <w:rFonts w:ascii="Times New Roman" w:cs="Times New Roman" w:eastAsia="Times New Roman" w:hAnsi="Times New Roman"/>
+              </w:rPr>
+              <w:t xml:space="preserve">Giao dịch ngoài kỳ (đơn đặt tháng 12/2024, giao hoặc trả tháng 01/2026) vẫn được nạp nhưng ghi "Ngoài kỳ đối soát".</w:t>
+            </w:r>
+          </w:p>
+          <w:p>
+            <w:pPr>
+              <w:pStyle w:val="ListParagraph"/>
+              <w:numPr>
+                <w:ilvl w:val="0"/>
+                <w:numId w:val="2"/>
+              </w:numPr>
+              <w:spacing w:after="30"/>
+            </w:pPr>
+            <w:r>
+              <w:rPr>
+                <w:rFonts w:ascii="Times New Roman" w:cs="Times New Roman" w:eastAsia="Times New Roman" w:hAnsi="Times New Roman"/>
+              </w:rPr>
+              <w:t xml:space="preserve">Thêm ngày 18/10/2026: quy ước này đã dùng từ plan </w:t>
+            </w:r>
+            <w:r>
+              <w:rPr>
+                <w:rFonts w:ascii="Times New Roman" w:cs="Times New Roman" w:eastAsia="Times New Roman" w:hAnsi="Times New Roman"/>
+                <w:color w:val="9C2B2B"/>
+                <w:sz w:val="24"/>
+                <w:szCs w:val="24"/>
+                <w:shd w:fill="EEEEEE" w:color="auto" w:val="clear"/>
+              </w:rPr>
+              <w:t xml:space="preserve">store-recon</w:t>
+            </w:r>
+            <w:r>
+              <w:rPr>
+                <w:rFonts w:ascii="Times New Roman" w:cs="Times New Roman" w:eastAsia="Times New Roman" w:hAnsi="Times New Roman"/>
+              </w:rPr>
+              <w:t xml:space="preserve"> nhưng trước đây chỉ ghi trong ghi chú của truy vấn.</w:t>
             </w:r>
           </w:p>
         </w:tc>
@@ -1248,111 +1152,271 @@
         </w:trPr>
         <w:tc>
           <w:tcPr>
-            <w:tcW w:type="dxa" w:w="3336"/>
-            <w:tcBorders>
-              <w:top w:val="single" w:color="BFC9D9" w:sz="4"/>
-              <w:left w:val="single" w:color="BFC9D9" w:sz="4"/>
-              <w:bottom w:val="single" w:color="BFC9D9" w:sz="4"/>
-              <w:right w:val="single" w:color="BFC9D9" w:sz="4"/>
-            </w:tcBorders>
-            <w:tcMar>
-              <w:top w:type="dxa" w:w="70"/>
-              <w:left w:type="dxa" w:w="110"/>
-              <w:bottom w:type="dxa" w:w="70"/>
-              <w:right w:type="dxa" w:w="110"/>
-            </w:tcMar>
-          </w:tcPr>
-          <w:p>
-            <w:pPr>
-              <w:spacing w:after="40"/>
-              <w:jc w:val="left"/>
-            </w:pPr>
-            <w:r>
-              <w:rPr>
-                <w:rFonts w:ascii="Times New Roman" w:cs="Times New Roman" w:eastAsia="Times New Roman" w:hAnsi="Times New Roman"/>
-              </w:rPr>
-              <w:t xml:space="preserve">Tên các khoản so với slide 12</w:t>
-            </w:r>
-          </w:p>
-        </w:tc>
-        <w:tc>
-          <w:tcPr>
-            <w:tcW w:type="dxa" w:w="6302"/>
-            <w:tcBorders>
-              <w:top w:val="single" w:color="BFC9D9" w:sz="4"/>
-              <w:left w:val="single" w:color="BFC9D9" w:sz="4"/>
-              <w:bottom w:val="single" w:color="BFC9D9" w:sz="4"/>
-              <w:right w:val="single" w:color="BFC9D9" w:sz="4"/>
-            </w:tcBorders>
-            <w:tcMar>
-              <w:top w:type="dxa" w:w="70"/>
-              <w:left w:type="dxa" w:w="110"/>
-              <w:bottom w:type="dxa" w:w="70"/>
-              <w:right w:type="dxa" w:w="110"/>
-            </w:tcMar>
-          </w:tcPr>
-          <w:p>
-            <w:pPr>
-              <w:pStyle w:val="ListParagraph"/>
-              <w:numPr>
-                <w:ilvl w:val="0"/>
-                <w:numId w:val="2"/>
-              </w:numPr>
-              <w:spacing w:after="30"/>
-            </w:pPr>
-            <w:r>
-              <w:rPr>
-                <w:rFonts w:ascii="Times New Roman" w:cs="Times New Roman" w:eastAsia="Times New Roman" w:hAnsi="Times New Roman"/>
-              </w:rPr>
-              <w:t xml:space="preserve">"Trùng dòng" = dòng POS trùng.</w:t>
-            </w:r>
-          </w:p>
-          <w:p>
-            <w:pPr>
-              <w:pStyle w:val="ListParagraph"/>
-              <w:numPr>
-                <w:ilvl w:val="0"/>
-                <w:numId w:val="2"/>
-              </w:numPr>
-              <w:spacing w:after="30"/>
-            </w:pPr>
-            <w:r>
-              <w:rPr>
-                <w:rFonts w:ascii="Times New Roman" w:cs="Times New Roman" w:eastAsia="Times New Roman" w:hAnsi="Times New Roman"/>
-              </w:rPr>
-              <w:t xml:space="preserve">"Ngày hạch toán" = lệch ngày ghi sổ của cửa hàng.</w:t>
-            </w:r>
-          </w:p>
-          <w:p>
-            <w:pPr>
-              <w:pStyle w:val="ListParagraph"/>
-              <w:numPr>
-                <w:ilvl w:val="0"/>
-                <w:numId w:val="2"/>
-              </w:numPr>
-              <w:spacing w:after="30"/>
-            </w:pPr>
-            <w:r>
-              <w:rPr>
-                <w:rFonts w:ascii="Times New Roman" w:cs="Times New Roman" w:eastAsia="Times New Roman" w:hAnsi="Times New Roman"/>
-              </w:rPr>
-              <w:t xml:space="preserve">"Thiếu bút toán" = lỗi chuyển dữ liệu.</w:t>
-            </w:r>
-          </w:p>
-          <w:p>
-            <w:pPr>
-              <w:pStyle w:val="ListParagraph"/>
-              <w:numPr>
-                <w:ilvl w:val="0"/>
-                <w:numId w:val="2"/>
-              </w:numPr>
-              <w:spacing w:after="30"/>
-            </w:pPr>
-            <w:r>
-              <w:rPr>
-                <w:rFonts w:ascii="Times New Roman" w:cs="Times New Roman" w:eastAsia="Times New Roman" w:hAnsi="Times New Roman"/>
-              </w:rPr>
-              <w:t xml:space="preserve">"Bút toán tay" = phí vận chuyển (và chuyển kênh, ở bảng theo kênh). Bút toán ADJ-0925 tách riêng, xem dòng dưới.</w:t>
+            <w:tcW w:type="dxa" w:w="3300"/>
+            <w:tcBorders>
+              <w:top w:val="single" w:color="BFC9D9" w:sz="4"/>
+              <w:left w:val="single" w:color="BFC9D9" w:sz="4"/>
+              <w:bottom w:val="single" w:color="BFC9D9" w:sz="4"/>
+              <w:right w:val="single" w:color="BFC9D9" w:sz="4"/>
+            </w:tcBorders>
+            <w:tcMar>
+              <w:top w:type="dxa" w:w="70"/>
+              <w:left w:type="dxa" w:w="110"/>
+              <w:bottom w:type="dxa" w:w="70"/>
+              <w:right w:type="dxa" w:w="110"/>
+            </w:tcMar>
+          </w:tcPr>
+          <w:p>
+            <w:pPr>
+              <w:spacing w:after="40"/>
+              <w:jc w:val="left"/>
+            </w:pPr>
+            <w:r>
+              <w:rPr>
+                <w:rFonts w:ascii="Times New Roman" w:cs="Times New Roman" w:eastAsia="Times New Roman" w:hAnsi="Times New Roman"/>
+              </w:rPr>
+              <w:t xml:space="preserve">Thứ tự các bước trong bảng cầu nối</w:t>
+            </w:r>
+          </w:p>
+        </w:tc>
+        <w:tc>
+          <w:tcPr>
+            <w:tcW w:type="dxa" w:w="6338"/>
+            <w:tcBorders>
+              <w:top w:val="single" w:color="BFC9D9" w:sz="4"/>
+              <w:left w:val="single" w:color="BFC9D9" w:sz="4"/>
+              <w:bottom w:val="single" w:color="BFC9D9" w:sz="4"/>
+              <w:right w:val="single" w:color="BFC9D9" w:sz="4"/>
+            </w:tcBorders>
+            <w:tcMar>
+              <w:top w:type="dxa" w:w="70"/>
+              <w:left w:type="dxa" w:w="110"/>
+              <w:bottom w:type="dxa" w:w="70"/>
+              <w:right w:type="dxa" w:w="110"/>
+            </w:tcMar>
+          </w:tcPr>
+          <w:p>
+            <w:pPr>
+              <w:pStyle w:val="ListParagraph"/>
+              <w:numPr>
+                <w:ilvl w:val="0"/>
+                <w:numId w:val="3"/>
+              </w:numPr>
+              <w:spacing w:after="30"/>
+            </w:pPr>
+            <w:r>
+              <w:rPr>
+                <w:rFonts w:ascii="Times New Roman" w:cs="Times New Roman" w:eastAsia="Times New Roman" w:hAnsi="Times New Roman"/>
+              </w:rPr>
+              <w:t xml:space="preserve">Flash</w:t>
+            </w:r>
+          </w:p>
+          <w:p>
+            <w:pPr>
+              <w:pStyle w:val="ListParagraph"/>
+              <w:numPr>
+                <w:ilvl w:val="0"/>
+                <w:numId w:val="3"/>
+              </w:numPr>
+              <w:spacing w:after="30"/>
+            </w:pPr>
+            <w:r>
+              <w:rPr>
+                <w:rFonts w:ascii="Times New Roman" w:cs="Times New Roman" w:eastAsia="Times New Roman" w:hAnsi="Times New Roman"/>
+              </w:rPr>
+              <w:t xml:space="preserve">Chiết khấu</w:t>
+            </w:r>
+          </w:p>
+          <w:p>
+            <w:pPr>
+              <w:pStyle w:val="ListParagraph"/>
+              <w:numPr>
+                <w:ilvl w:val="0"/>
+                <w:numId w:val="3"/>
+              </w:numPr>
+              <w:spacing w:after="30"/>
+            </w:pPr>
+            <w:r>
+              <w:rPr>
+                <w:rFonts w:ascii="Times New Roman" w:cs="Times New Roman" w:eastAsia="Times New Roman" w:hAnsi="Times New Roman"/>
+              </w:rPr>
+              <w:t xml:space="preserve">Dòng POS trùng (POS – Point of Sale, bán tại cửa hàng)</w:t>
+            </w:r>
+          </w:p>
+          <w:p>
+            <w:pPr>
+              <w:pStyle w:val="ListParagraph"/>
+              <w:numPr>
+                <w:ilvl w:val="0"/>
+                <w:numId w:val="3"/>
+              </w:numPr>
+              <w:spacing w:after="30"/>
+            </w:pPr>
+            <w:r>
+              <w:rPr>
+                <w:rFonts w:ascii="Times New Roman" w:cs="Times New Roman" w:eastAsia="Times New Roman" w:hAnsi="Times New Roman"/>
+              </w:rPr>
+              <w:t xml:space="preserve">Đơn hủy</w:t>
+            </w:r>
+          </w:p>
+          <w:p>
+            <w:pPr>
+              <w:pStyle w:val="ListParagraph"/>
+              <w:numPr>
+                <w:ilvl w:val="0"/>
+                <w:numId w:val="3"/>
+              </w:numPr>
+              <w:spacing w:after="30"/>
+            </w:pPr>
+            <w:r>
+              <w:rPr>
+                <w:rFonts w:ascii="Times New Roman" w:cs="Times New Roman" w:eastAsia="Times New Roman" w:hAnsi="Times New Roman"/>
+              </w:rPr>
+              <w:t xml:space="preserve">Lệch thời điểm online</w:t>
+            </w:r>
+          </w:p>
+          <w:p>
+            <w:pPr>
+              <w:pStyle w:val="ListParagraph"/>
+              <w:numPr>
+                <w:ilvl w:val="0"/>
+                <w:numId w:val="3"/>
+              </w:numPr>
+              <w:spacing w:after="30"/>
+            </w:pPr>
+            <w:r>
+              <w:rPr>
+                <w:rFonts w:ascii="Times New Roman" w:cs="Times New Roman" w:eastAsia="Times New Roman" w:hAnsi="Times New Roman"/>
+              </w:rPr>
+              <w:t xml:space="preserve">Lệch ngày ghi sổ của cửa hàng</w:t>
+            </w:r>
+          </w:p>
+          <w:p>
+            <w:pPr>
+              <w:pStyle w:val="ListParagraph"/>
+              <w:numPr>
+                <w:ilvl w:val="0"/>
+                <w:numId w:val="3"/>
+              </w:numPr>
+              <w:spacing w:after="30"/>
+            </w:pPr>
+            <w:r>
+              <w:rPr>
+                <w:rFonts w:ascii="Times New Roman" w:cs="Times New Roman" w:eastAsia="Times New Roman" w:hAnsi="Times New Roman"/>
+              </w:rPr>
+              <w:t xml:space="preserve">Lỗi chuyển dữ liệu</w:t>
+            </w:r>
+          </w:p>
+          <w:p>
+            <w:pPr>
+              <w:pStyle w:val="ListParagraph"/>
+              <w:numPr>
+                <w:ilvl w:val="0"/>
+                <w:numId w:val="3"/>
+              </w:numPr>
+              <w:spacing w:after="30"/>
+            </w:pPr>
+            <w:r>
+              <w:rPr>
+                <w:rFonts w:ascii="Times New Roman" w:cs="Times New Roman" w:eastAsia="Times New Roman" w:hAnsi="Times New Roman"/>
+              </w:rPr>
+              <w:t xml:space="preserve">Hàng trả</w:t>
+            </w:r>
+          </w:p>
+          <w:p>
+            <w:pPr>
+              <w:pStyle w:val="ListParagraph"/>
+              <w:numPr>
+                <w:ilvl w:val="0"/>
+                <w:numId w:val="3"/>
+              </w:numPr>
+              <w:spacing w:after="30"/>
+            </w:pPr>
+            <w:r>
+              <w:rPr>
+                <w:rFonts w:ascii="Times New Roman" w:cs="Times New Roman" w:eastAsia="Times New Roman" w:hAnsi="Times New Roman"/>
+              </w:rPr>
+              <w:t xml:space="preserve">Phí vận chuyển</w:t>
+            </w:r>
+          </w:p>
+          <w:p>
+            <w:pPr>
+              <w:pStyle w:val="ListParagraph"/>
+              <w:numPr>
+                <w:ilvl w:val="0"/>
+                <w:numId w:val="3"/>
+              </w:numPr>
+              <w:spacing w:after="30"/>
+            </w:pPr>
+            <w:r>
+              <w:rPr>
+                <w:rFonts w:ascii="Times New Roman" w:cs="Times New Roman" w:eastAsia="Times New Roman" w:hAnsi="Times New Roman"/>
+              </w:rPr>
+              <w:t xml:space="preserve">Chuyển kênh MJ-RCL (chỉ có ở bảng cầu nối theo kênh)</w:t>
+            </w:r>
+          </w:p>
+          <w:p>
+            <w:pPr>
+              <w:pStyle w:val="ListParagraph"/>
+              <w:numPr>
+                <w:ilvl w:val="0"/>
+                <w:numId w:val="3"/>
+              </w:numPr>
+              <w:spacing w:after="30"/>
+            </w:pPr>
+            <w:r>
+              <w:rPr>
+                <w:rFonts w:ascii="Times New Roman" w:cs="Times New Roman" w:eastAsia="Times New Roman" w:hAnsi="Times New Roman"/>
+              </w:rPr>
+              <w:t xml:space="preserve">Tỷ giá</w:t>
+            </w:r>
+          </w:p>
+          <w:p>
+            <w:pPr>
+              <w:pStyle w:val="ListParagraph"/>
+              <w:numPr>
+                <w:ilvl w:val="0"/>
+                <w:numId w:val="3"/>
+              </w:numPr>
+              <w:spacing w:after="30"/>
+            </w:pPr>
+            <w:r>
+              <w:rPr>
+                <w:rFonts w:ascii="Times New Roman" w:cs="Times New Roman" w:eastAsia="Times New Roman" w:hAnsi="Times New Roman"/>
+              </w:rPr>
+              <w:t xml:space="preserve">Làm tròn</w:t>
+            </w:r>
+          </w:p>
+          <w:p>
+            <w:pPr>
+              <w:pStyle w:val="ListParagraph"/>
+              <w:numPr>
+                <w:ilvl w:val="0"/>
+                <w:numId w:val="3"/>
+              </w:numPr>
+              <w:spacing w:after="30"/>
+            </w:pPr>
+            <w:r>
+              <w:rPr>
+                <w:rFonts w:ascii="Times New Roman" w:cs="Times New Roman" w:eastAsia="Times New Roman" w:hAnsi="Times New Roman"/>
+              </w:rPr>
+              <w:t xml:space="preserve">Chưa giải thích</w:t>
+            </w:r>
+          </w:p>
+          <w:p>
+            <w:pPr>
+              <w:pStyle w:val="ListParagraph"/>
+              <w:numPr>
+                <w:ilvl w:val="0"/>
+                <w:numId w:val="3"/>
+              </w:numPr>
+              <w:spacing w:after="30"/>
+            </w:pPr>
+            <w:r>
+              <w:rPr>
+                <w:rFonts w:ascii="Times New Roman" w:cs="Times New Roman" w:eastAsia="Times New Roman" w:hAnsi="Times New Roman"/>
+              </w:rPr>
+              <w:t xml:space="preserve">Sổ cái</w:t>
             </w:r>
           </w:p>
         </w:tc>
@@ -1363,7 +1427,7 @@
         </w:trPr>
         <w:tc>
           <w:tcPr>
-            <w:tcW w:type="dxa" w:w="3336"/>
+            <w:tcW w:type="dxa" w:w="3300"/>
             <w:tcBorders>
               <w:top w:val="single" w:color="BFC9D9" w:sz="4"/>
               <w:left w:val="single" w:color="BFC9D9" w:sz="4"/>
@@ -1387,13 +1451,13 @@
               <w:rPr>
                 <w:rFonts w:ascii="Times New Roman" w:cs="Times New Roman" w:eastAsia="Times New Roman" w:hAnsi="Times New Roman"/>
               </w:rPr>
-              <w:t xml:space="preserve">Vì sao theo thứ tự này</w:t>
-            </w:r>
-          </w:p>
-        </w:tc>
-        <w:tc>
-          <w:tcPr>
-            <w:tcW w:type="dxa" w:w="6302"/>
+              <w:t xml:space="preserve">Tên các khoản so với slide 12</w:t>
+            </w:r>
+          </w:p>
+        </w:tc>
+        <w:tc>
+          <w:tcPr>
+            <w:tcW w:type="dxa" w:w="6338"/>
             <w:tcBorders>
               <w:top w:val="single" w:color="BFC9D9" w:sz="4"/>
               <w:left w:val="single" w:color="BFC9D9" w:sz="4"/>
@@ -1421,23 +1485,55 @@
               <w:rPr>
                 <w:rFonts w:ascii="Times New Roman" w:cs="Times New Roman" w:eastAsia="Times New Roman" w:hAnsi="Times New Roman"/>
               </w:rPr>
-              <w:t xml:space="preserve">Flash tính theo giá trước giảm giá và đã gồm cả dòng trùng lẫn đơn hủy.</w:t>
-            </w:r>
-          </w:p>
-          <w:p>
-            <w:pPr>
-              <w:pStyle w:val="ListParagraph"/>
-              <w:numPr>
-                <w:ilvl w:val="0"/>
-                <w:numId w:val="2"/>
-              </w:numPr>
-              <w:spacing w:after="30"/>
-            </w:pPr>
-            <w:r>
-              <w:rPr>
-                <w:rFonts w:ascii="Times New Roman" w:cs="Times New Roman" w:eastAsia="Times New Roman" w:hAnsi="Times New Roman"/>
-              </w:rPr>
-              <w:t xml:space="preserve">Trừ chiết khấu trước thì dòng trùng và đơn hủy được tính theo giá sau giảm giá, giống cách sổ cái ghi.</w:t>
+              <w:t xml:space="preserve">"Trùng dòng" = dòng POS trùng.</w:t>
+            </w:r>
+          </w:p>
+          <w:p>
+            <w:pPr>
+              <w:pStyle w:val="ListParagraph"/>
+              <w:numPr>
+                <w:ilvl w:val="0"/>
+                <w:numId w:val="2"/>
+              </w:numPr>
+              <w:spacing w:after="30"/>
+            </w:pPr>
+            <w:r>
+              <w:rPr>
+                <w:rFonts w:ascii="Times New Roman" w:cs="Times New Roman" w:eastAsia="Times New Roman" w:hAnsi="Times New Roman"/>
+              </w:rPr>
+              <w:t xml:space="preserve">"Ngày hạch toán" = lệch ngày ghi sổ của cửa hàng.</w:t>
+            </w:r>
+          </w:p>
+          <w:p>
+            <w:pPr>
+              <w:pStyle w:val="ListParagraph"/>
+              <w:numPr>
+                <w:ilvl w:val="0"/>
+                <w:numId w:val="2"/>
+              </w:numPr>
+              <w:spacing w:after="30"/>
+            </w:pPr>
+            <w:r>
+              <w:rPr>
+                <w:rFonts w:ascii="Times New Roman" w:cs="Times New Roman" w:eastAsia="Times New Roman" w:hAnsi="Times New Roman"/>
+              </w:rPr>
+              <w:t xml:space="preserve">"Thiếu bút toán" = lỗi chuyển dữ liệu.</w:t>
+            </w:r>
+          </w:p>
+          <w:p>
+            <w:pPr>
+              <w:pStyle w:val="ListParagraph"/>
+              <w:numPr>
+                <w:ilvl w:val="0"/>
+                <w:numId w:val="2"/>
+              </w:numPr>
+              <w:spacing w:after="30"/>
+            </w:pPr>
+            <w:r>
+              <w:rPr>
+                <w:rFonts w:ascii="Times New Roman" w:cs="Times New Roman" w:eastAsia="Times New Roman" w:hAnsi="Times New Roman"/>
+              </w:rPr>
+              <w:t xml:space="preserve">"Bút toán tay" = phí vận chuyển (và chuyển kênh, ở bảng theo kênh). Bút toán ADJ-0925 tách riêng, xem dòng dưới.</w:t>
             </w:r>
           </w:p>
         </w:tc>
@@ -1448,171 +1544,79 @@
         </w:trPr>
         <w:tc>
           <w:tcPr>
-            <w:tcW w:type="dxa" w:w="3336"/>
-            <w:tcBorders>
-              <w:top w:val="single" w:color="BFC9D9" w:sz="4"/>
-              <w:left w:val="single" w:color="BFC9D9" w:sz="4"/>
-              <w:bottom w:val="single" w:color="BFC9D9" w:sz="4"/>
-              <w:right w:val="single" w:color="BFC9D9" w:sz="4"/>
-            </w:tcBorders>
-            <w:tcMar>
-              <w:top w:type="dxa" w:w="70"/>
-              <w:left w:type="dxa" w:w="110"/>
-              <w:bottom w:type="dxa" w:w="70"/>
-              <w:right w:type="dxa" w:w="110"/>
-            </w:tcMar>
-          </w:tcPr>
-          <w:p>
-            <w:pPr>
-              <w:spacing w:after="40"/>
-              <w:jc w:val="left"/>
-            </w:pPr>
-            <w:r>
-              <w:rPr>
-                <w:rFonts w:ascii="Times New Roman" w:cs="Times New Roman" w:eastAsia="Times New Roman" w:hAnsi="Times New Roman"/>
-              </w:rPr>
-              <w:t xml:space="preserve">Tỷ giá dùng trong từng khoản</w:t>
-            </w:r>
-          </w:p>
-        </w:tc>
-        <w:tc>
-          <w:tcPr>
-            <w:tcW w:type="dxa" w:w="6302"/>
-            <w:tcBorders>
-              <w:top w:val="single" w:color="BFC9D9" w:sz="4"/>
-              <w:left w:val="single" w:color="BFC9D9" w:sz="4"/>
-              <w:bottom w:val="single" w:color="BFC9D9" w:sz="4"/>
-              <w:right w:val="single" w:color="BFC9D9" w:sz="4"/>
-            </w:tcBorders>
-            <w:tcMar>
-              <w:top w:type="dxa" w:w="70"/>
-              <w:left w:type="dxa" w:w="110"/>
-              <w:bottom w:type="dxa" w:w="70"/>
-              <w:right w:type="dxa" w:w="110"/>
-            </w:tcMar>
-          </w:tcPr>
-          <w:p>
-            <w:pPr>
-              <w:pStyle w:val="ListParagraph"/>
-              <w:numPr>
-                <w:ilvl w:val="0"/>
-                <w:numId w:val="2"/>
-              </w:numPr>
-              <w:spacing w:after="30"/>
-            </w:pPr>
-            <w:r>
-              <w:rPr>
-                <w:rFonts w:ascii="Times New Roman" w:cs="Times New Roman" w:eastAsia="Times New Roman" w:hAnsi="Times New Roman"/>
-              </w:rPr>
-              <w:t xml:space="preserve">Mọi khoản đứng trước dòng tỷ giá đều đổi ra USD theo </w:t>
-            </w:r>
-            <w:r>
-              <w:rPr>
-                <w:rFonts w:ascii="Times New Roman" w:cs="Times New Roman" w:eastAsia="Times New Roman" w:hAnsi="Times New Roman"/>
-                <w:b/>
-                <w:bCs/>
-              </w:rPr>
-              <w:t xml:space="preserve">tỷ giá của ngày đặt hàng / ngày bán</w:t>
-            </w:r>
-            <w:r>
-              <w:rPr>
-                <w:rFonts w:ascii="Times New Roman" w:cs="Times New Roman" w:eastAsia="Times New Roman" w:hAnsi="Times New Roman"/>
-              </w:rPr>
-              <w:t xml:space="preserve">.</w:t>
-            </w:r>
-          </w:p>
-          <w:p>
-            <w:pPr>
-              <w:pStyle w:val="ListParagraph"/>
-              <w:numPr>
-                <w:ilvl w:val="0"/>
-                <w:numId w:val="2"/>
-              </w:numPr>
-              <w:spacing w:after="30"/>
-            </w:pPr>
-            <w:r>
-              <w:rPr>
-                <w:rFonts w:ascii="Times New Roman" w:cs="Times New Roman" w:eastAsia="Times New Roman" w:hAnsi="Times New Roman"/>
-              </w:rPr>
-              <w:t xml:space="preserve">Hàng trả cũng tính theo tỷ giá </w:t>
-            </w:r>
-            <w:r>
-              <w:rPr>
-                <w:rFonts w:ascii="Times New Roman" w:cs="Times New Roman" w:eastAsia="Times New Roman" w:hAnsi="Times New Roman"/>
-                <w:b/>
-                <w:bCs/>
-              </w:rPr>
-              <w:t xml:space="preserve">ngày đặt hàng</w:t>
-            </w:r>
-            <w:r>
-              <w:rPr>
-                <w:rFonts w:ascii="Times New Roman" w:cs="Times New Roman" w:eastAsia="Times New Roman" w:hAnsi="Times New Roman"/>
-              </w:rPr>
-              <w:t xml:space="preserve">: ra −349.148,23.</w:t>
-            </w:r>
-          </w:p>
-          <w:p>
-            <w:pPr>
-              <w:pStyle w:val="ListParagraph"/>
-              <w:numPr>
-                <w:ilvl w:val="0"/>
-                <w:numId w:val="2"/>
-              </w:numPr>
-              <w:spacing w:after="30"/>
-            </w:pPr>
-            <w:r>
-              <w:rPr>
-                <w:rFonts w:ascii="Times New Roman" w:cs="Times New Roman" w:eastAsia="Times New Roman" w:hAnsi="Times New Roman"/>
-              </w:rPr>
-              <w:t xml:space="preserve">Để so sánh:</w:t>
-            </w:r>
-          </w:p>
-          <w:p>
-            <w:pPr>
-              <w:pStyle w:val="ListParagraph"/>
-              <w:numPr>
-                <w:ilvl w:val="1"/>
-                <w:numId w:val="2"/>
-              </w:numPr>
-              <w:spacing w:after="30"/>
-            </w:pPr>
-            <w:r>
-              <w:rPr>
-                <w:rFonts w:ascii="Times New Roman" w:cs="Times New Roman" w:eastAsia="Times New Roman" w:hAnsi="Times New Roman"/>
-              </w:rPr>
-              <w:t xml:space="preserve">Nếu dùng tỷ giá ngày trả hàng: −349.652,76.</w:t>
-            </w:r>
-          </w:p>
-          <w:p>
-            <w:pPr>
-              <w:pStyle w:val="ListParagraph"/>
-              <w:numPr>
-                <w:ilvl w:val="1"/>
-                <w:numId w:val="2"/>
-              </w:numPr>
-              <w:spacing w:after="30"/>
-            </w:pPr>
-            <w:r>
-              <w:rPr>
-                <w:rFonts w:ascii="Times New Roman" w:cs="Times New Roman" w:eastAsia="Times New Roman" w:hAnsi="Times New Roman"/>
-              </w:rPr>
-              <w:t xml:space="preserve">Sổ cái dùng tỷ giá cuối tháng: −349.066,23.</w:t>
-            </w:r>
-          </w:p>
-          <w:p>
-            <w:pPr>
-              <w:pStyle w:val="ListParagraph"/>
-              <w:numPr>
-                <w:ilvl w:val="0"/>
-                <w:numId w:val="2"/>
-              </w:numPr>
-              <w:spacing w:after="30"/>
-            </w:pPr>
-            <w:r>
-              <w:rPr>
-                <w:rFonts w:ascii="Times New Roman" w:cs="Times New Roman" w:eastAsia="Times New Roman" w:hAnsi="Times New Roman"/>
-              </w:rPr>
-              <w:t xml:space="preserve">Dòng tỷ giá = (số USD trên sổ cái, tính theo tỷ giá cuối tháng) − (cũng các giao dịch đó, tính theo tỷ giá ngày).</w:t>
+            <w:tcW w:type="dxa" w:w="3300"/>
+            <w:tcBorders>
+              <w:top w:val="single" w:color="BFC9D9" w:sz="4"/>
+              <w:left w:val="single" w:color="BFC9D9" w:sz="4"/>
+              <w:bottom w:val="single" w:color="BFC9D9" w:sz="4"/>
+              <w:right w:val="single" w:color="BFC9D9" w:sz="4"/>
+            </w:tcBorders>
+            <w:tcMar>
+              <w:top w:type="dxa" w:w="70"/>
+              <w:left w:type="dxa" w:w="110"/>
+              <w:bottom w:type="dxa" w:w="70"/>
+              <w:right w:type="dxa" w:w="110"/>
+            </w:tcMar>
+          </w:tcPr>
+          <w:p>
+            <w:pPr>
+              <w:spacing w:after="40"/>
+              <w:jc w:val="left"/>
+            </w:pPr>
+            <w:r>
+              <w:rPr>
+                <w:rFonts w:ascii="Times New Roman" w:cs="Times New Roman" w:eastAsia="Times New Roman" w:hAnsi="Times New Roman"/>
+              </w:rPr>
+              <w:t xml:space="preserve">Vì sao theo thứ tự này</w:t>
+            </w:r>
+          </w:p>
+        </w:tc>
+        <w:tc>
+          <w:tcPr>
+            <w:tcW w:type="dxa" w:w="6338"/>
+            <w:tcBorders>
+              <w:top w:val="single" w:color="BFC9D9" w:sz="4"/>
+              <w:left w:val="single" w:color="BFC9D9" w:sz="4"/>
+              <w:bottom w:val="single" w:color="BFC9D9" w:sz="4"/>
+              <w:right w:val="single" w:color="BFC9D9" w:sz="4"/>
+            </w:tcBorders>
+            <w:tcMar>
+              <w:top w:type="dxa" w:w="70"/>
+              <w:left w:type="dxa" w:w="110"/>
+              <w:bottom w:type="dxa" w:w="70"/>
+              <w:right w:type="dxa" w:w="110"/>
+            </w:tcMar>
+          </w:tcPr>
+          <w:p>
+            <w:pPr>
+              <w:pStyle w:val="ListParagraph"/>
+              <w:numPr>
+                <w:ilvl w:val="0"/>
+                <w:numId w:val="2"/>
+              </w:numPr>
+              <w:spacing w:after="30"/>
+            </w:pPr>
+            <w:r>
+              <w:rPr>
+                <w:rFonts w:ascii="Times New Roman" w:cs="Times New Roman" w:eastAsia="Times New Roman" w:hAnsi="Times New Roman"/>
+              </w:rPr>
+              <w:t xml:space="preserve">Flash tính theo giá trước giảm giá và đã gồm cả dòng trùng lẫn đơn hủy.</w:t>
+            </w:r>
+          </w:p>
+          <w:p>
+            <w:pPr>
+              <w:pStyle w:val="ListParagraph"/>
+              <w:numPr>
+                <w:ilvl w:val="0"/>
+                <w:numId w:val="2"/>
+              </w:numPr>
+              <w:spacing w:after="30"/>
+            </w:pPr>
+            <w:r>
+              <w:rPr>
+                <w:rFonts w:ascii="Times New Roman" w:cs="Times New Roman" w:eastAsia="Times New Roman" w:hAnsi="Times New Roman"/>
+              </w:rPr>
+              <w:t xml:space="preserve">Trừ chiết khấu trước thì dòng trùng và đơn hủy được tính theo giá sau giảm giá, giống cách sổ cái ghi.</w:t>
             </w:r>
           </w:p>
         </w:tc>
@@ -1623,7 +1627,7 @@
         </w:trPr>
         <w:tc>
           <w:tcPr>
-            <w:tcW w:type="dxa" w:w="3336"/>
+            <w:tcW w:type="dxa" w:w="3300"/>
             <w:tcBorders>
               <w:top w:val="single" w:color="BFC9D9" w:sz="4"/>
               <w:left w:val="single" w:color="BFC9D9" w:sz="4"/>
@@ -1647,13 +1651,13 @@
               <w:rPr>
                 <w:rFonts w:ascii="Times New Roman" w:cs="Times New Roman" w:eastAsia="Times New Roman" w:hAnsi="Times New Roman"/>
               </w:rPr>
-              <w:t xml:space="preserve">Bút toán ADJ-0925 (ADJ = Adjustment, bút toán điều chỉnh; 1.250 USD)</w:t>
-            </w:r>
-          </w:p>
-        </w:tc>
-        <w:tc>
-          <w:tcPr>
-            <w:tcW w:type="dxa" w:w="6302"/>
+              <w:t xml:space="preserve">Tỷ giá dùng trong từng khoản</w:t>
+            </w:r>
+          </w:p>
+        </w:tc>
+        <w:tc>
+          <w:tcPr>
+            <w:tcW w:type="dxa" w:w="6338"/>
             <w:tcBorders>
               <w:top w:val="single" w:color="BFC9D9" w:sz="4"/>
               <w:left w:val="single" w:color="BFC9D9" w:sz="4"/>
@@ -1681,7 +1685,7 @@
               <w:rPr>
                 <w:rFonts w:ascii="Times New Roman" w:cs="Times New Roman" w:eastAsia="Times New Roman" w:hAnsi="Times New Roman"/>
               </w:rPr>
-              <w:t xml:space="preserve">Luôn để ở dòng </w:t>
+              <w:t xml:space="preserve">Mọi khoản đứng trước dòng tỷ giá đều đổi ra USD theo </w:t>
             </w:r>
             <w:r>
               <w:rPr>
@@ -1689,7 +1693,7 @@
                 <w:b/>
                 <w:bCs/>
               </w:rPr>
-              <w:t xml:space="preserve">"Chưa giải thích được"</w:t>
+              <w:t xml:space="preserve">tỷ giá của ngày đặt hàng / ngày bán</w:t>
             </w:r>
             <w:r>
               <w:rPr>
@@ -1711,23 +1715,7 @@
               <w:rPr>
                 <w:rFonts w:ascii="Times New Roman" w:cs="Times New Roman" w:eastAsia="Times New Roman" w:hAnsi="Times New Roman"/>
               </w:rPr>
-              <w:t xml:space="preserve">Không gộp vào dòng phí vận chuyển hay dòng làm tròn.</w:t>
-            </w:r>
-          </w:p>
-          <w:p>
-            <w:pPr>
-              <w:pStyle w:val="ListParagraph"/>
-              <w:numPr>
-                <w:ilvl w:val="0"/>
-                <w:numId w:val="2"/>
-              </w:numPr>
-              <w:spacing w:after="30"/>
-            </w:pPr>
-            <w:r>
-              <w:rPr>
-                <w:rFonts w:ascii="Times New Roman" w:cs="Times New Roman" w:eastAsia="Times New Roman" w:hAnsi="Times New Roman"/>
-              </w:rPr>
-              <w:t xml:space="preserve">Slide 32 gộp nó chung với phí vận chuyển dưới tên "bút toán tay", </w:t>
+              <w:t xml:space="preserve">Hàng trả cũng tính theo tỷ giá </w:t>
             </w:r>
             <w:r>
               <w:rPr>
@@ -1735,13 +1723,151 @@
                 <w:b/>
                 <w:bCs/>
               </w:rPr>
-              <w:t xml:space="preserve">không chép theo cách đó</w:t>
-            </w:r>
-            <w:r>
-              <w:rPr>
-                <w:rFonts w:ascii="Times New Roman" w:cs="Times New Roman" w:eastAsia="Times New Roman" w:hAnsi="Times New Roman"/>
-              </w:rPr>
-              <w:t xml:space="preserve">.</w:t>
+              <w:t xml:space="preserve">ngày đặt hàng</w:t>
+            </w:r>
+            <w:r>
+              <w:rPr>
+                <w:rFonts w:ascii="Times New Roman" w:cs="Times New Roman" w:eastAsia="Times New Roman" w:hAnsi="Times New Roman"/>
+              </w:rPr>
+              <w:t xml:space="preserve">: ra −349.148,23.</w:t>
+            </w:r>
+          </w:p>
+          <w:p>
+            <w:pPr>
+              <w:pStyle w:val="ListParagraph"/>
+              <w:numPr>
+                <w:ilvl w:val="0"/>
+                <w:numId w:val="2"/>
+              </w:numPr>
+              <w:spacing w:after="30"/>
+            </w:pPr>
+            <w:r>
+              <w:rPr>
+                <w:rFonts w:ascii="Times New Roman" w:cs="Times New Roman" w:eastAsia="Times New Roman" w:hAnsi="Times New Roman"/>
+              </w:rPr>
+              <w:t xml:space="preserve">Để so sánh:</w:t>
+            </w:r>
+          </w:p>
+          <w:p>
+            <w:pPr>
+              <w:pStyle w:val="ListParagraph"/>
+              <w:numPr>
+                <w:ilvl w:val="1"/>
+                <w:numId w:val="2"/>
+              </w:numPr>
+              <w:spacing w:after="30"/>
+            </w:pPr>
+            <w:r>
+              <w:rPr>
+                <w:rFonts w:ascii="Times New Roman" w:cs="Times New Roman" w:eastAsia="Times New Roman" w:hAnsi="Times New Roman"/>
+              </w:rPr>
+              <w:t xml:space="preserve">Nếu dùng tỷ giá ngày trả hàng: −349.652,76.</w:t>
+            </w:r>
+          </w:p>
+          <w:p>
+            <w:pPr>
+              <w:pStyle w:val="ListParagraph"/>
+              <w:numPr>
+                <w:ilvl w:val="1"/>
+                <w:numId w:val="2"/>
+              </w:numPr>
+              <w:spacing w:after="30"/>
+            </w:pPr>
+            <w:r>
+              <w:rPr>
+                <w:rFonts w:ascii="Times New Roman" w:cs="Times New Roman" w:eastAsia="Times New Roman" w:hAnsi="Times New Roman"/>
+              </w:rPr>
+              <w:t xml:space="preserve">Sổ cái dùng tỷ giá cuối tháng: −349.066,23.</w:t>
+            </w:r>
+          </w:p>
+          <w:p>
+            <w:pPr>
+              <w:pStyle w:val="ListParagraph"/>
+              <w:numPr>
+                <w:ilvl w:val="0"/>
+                <w:numId w:val="2"/>
+              </w:numPr>
+              <w:spacing w:after="30"/>
+            </w:pPr>
+            <w:r>
+              <w:rPr>
+                <w:rFonts w:ascii="Times New Roman" w:cs="Times New Roman" w:eastAsia="Times New Roman" w:hAnsi="Times New Roman"/>
+              </w:rPr>
+              <w:t xml:space="preserve">Dòng tỷ giá = (nội tệ trên các bút toán sổ cái ghi tự động ÷ tỷ giá cuối tháng, </w:t>
+            </w:r>
+            <w:r>
+              <w:rPr>
+                <w:rFonts w:ascii="Times New Roman" w:cs="Times New Roman" w:eastAsia="Times New Roman" w:hAnsi="Times New Roman"/>
+                <w:b/>
+                <w:bCs/>
+              </w:rPr>
+              <w:t xml:space="preserve">chưa làm tròn</w:t>
+            </w:r>
+            <w:r>
+              <w:rPr>
+                <w:rFonts w:ascii="Times New Roman" w:cs="Times New Roman" w:eastAsia="Times New Roman" w:hAnsi="Times New Roman"/>
+              </w:rPr>
+              <w:t xml:space="preserve">) − (cùng các giao dịch đó ÷ tỷ giá ngày), đúng định nghĩa slide 34.</w:t>
+            </w:r>
+          </w:p>
+          <w:p>
+            <w:pPr>
+              <w:pStyle w:val="ListParagraph"/>
+              <w:numPr>
+                <w:ilvl w:val="0"/>
+                <w:numId w:val="2"/>
+              </w:numPr>
+              <w:spacing w:after="30"/>
+            </w:pPr>
+            <w:r>
+              <w:rPr>
+                <w:rFonts w:ascii="Times New Roman" w:cs="Times New Roman" w:eastAsia="Times New Roman" w:hAnsi="Times New Roman"/>
+              </w:rPr>
+              <w:t xml:space="preserve">Phần sổ cái làm tròn từng bút toán đến 2 chữ số </w:t>
+            </w:r>
+            <w:r>
+              <w:rPr>
+                <w:rFonts w:ascii="Times New Roman" w:cs="Times New Roman" w:eastAsia="Times New Roman" w:hAnsi="Times New Roman"/>
+                <w:b/>
+                <w:bCs/>
+              </w:rPr>
+              <w:t xml:space="preserve">không</w:t>
+            </w:r>
+            <w:r>
+              <w:rPr>
+                <w:rFonts w:ascii="Times New Roman" w:cs="Times New Roman" w:eastAsia="Times New Roman" w:hAnsi="Times New Roman"/>
+              </w:rPr>
+              <w:t xml:space="preserve"> nằm trong dòng tỷ giá mà nằm trong dòng làm tròn (sửa ngày 18/10, xem mục 4).</w:t>
+            </w:r>
+          </w:p>
+          <w:p>
+            <w:pPr>
+              <w:pStyle w:val="ListParagraph"/>
+              <w:numPr>
+                <w:ilvl w:val="0"/>
+                <w:numId w:val="2"/>
+              </w:numPr>
+              <w:spacing w:after="30"/>
+            </w:pPr>
+            <w:r>
+              <w:rPr>
+                <w:rFonts w:ascii="Times New Roman" w:cs="Times New Roman" w:eastAsia="Times New Roman" w:hAnsi="Times New Roman"/>
+              </w:rPr>
+              <w:t xml:space="preserve">Ngoại lệ: lỗi chuyển dữ liệu (bút toán sổ cái thiếu hoặc thừa so với POS) đổi theo tỷ giá ngày của </w:t>
+            </w:r>
+            <w:r>
+              <w:rPr>
+                <w:rFonts w:ascii="Times New Roman" w:cs="Times New Roman" w:eastAsia="Times New Roman" w:hAnsi="Times New Roman"/>
+                <w:b/>
+                <w:bCs/>
+              </w:rPr>
+              <w:t xml:space="preserve">ngày ghi sổ</w:t>
+            </w:r>
+            <w:r>
+              <w:rPr>
+                <w:rFonts w:ascii="Times New Roman" w:cs="Times New Roman" w:eastAsia="Times New Roman" w:hAnsi="Times New Roman"/>
+              </w:rPr>
+              <w:t xml:space="preserve">, vì bút toán sổ cái không ghi ngày bán. Năm 2025 chỉ có NX057 (tiền USD) nên không đổi số.</w:t>
             </w:r>
           </w:p>
         </w:tc>
@@ -1752,81 +1878,117 @@
         </w:trPr>
         <w:tc>
           <w:tcPr>
-            <w:tcW w:type="dxa" w:w="3336"/>
-            <w:tcBorders>
-              <w:top w:val="single" w:color="BFC9D9" w:sz="4"/>
-              <w:left w:val="single" w:color="BFC9D9" w:sz="4"/>
-              <w:bottom w:val="single" w:color="BFC9D9" w:sz="4"/>
-              <w:right w:val="single" w:color="BFC9D9" w:sz="4"/>
-            </w:tcBorders>
-            <w:tcMar>
-              <w:top w:type="dxa" w:w="70"/>
-              <w:left w:type="dxa" w:w="110"/>
-              <w:bottom w:type="dxa" w:w="70"/>
-              <w:right w:type="dxa" w:w="110"/>
-            </w:tcMar>
-          </w:tcPr>
-          <w:p>
-            <w:pPr>
-              <w:spacing w:after="40"/>
-              <w:jc w:val="left"/>
-            </w:pPr>
-            <w:r>
-              <w:rPr>
-                <w:rFonts w:ascii="Times New Roman" w:cs="Times New Roman" w:eastAsia="Times New Roman" w:hAnsi="Times New Roman"/>
-              </w:rPr>
-              <w:t xml:space="preserve">Bút toán MJ-RCL-2506 (MJ = Manual Journal, bút toán tay; RCL = Reclassification, phân loại lại): bút toán tay chuyển 3.480 USD từ cửa hàng NX019 sang online, tháng 6</w:t>
-            </w:r>
-          </w:p>
-        </w:tc>
-        <w:tc>
-          <w:tcPr>
-            <w:tcW w:type="dxa" w:w="6302"/>
-            <w:tcBorders>
-              <w:top w:val="single" w:color="BFC9D9" w:sz="4"/>
-              <w:left w:val="single" w:color="BFC9D9" w:sz="4"/>
-              <w:bottom w:val="single" w:color="BFC9D9" w:sz="4"/>
-              <w:right w:val="single" w:color="BFC9D9" w:sz="4"/>
-            </w:tcBorders>
-            <w:tcMar>
-              <w:top w:type="dxa" w:w="70"/>
-              <w:left w:type="dxa" w:w="110"/>
-              <w:bottom w:type="dxa" w:w="70"/>
-              <w:right w:type="dxa" w:w="110"/>
-            </w:tcMar>
-          </w:tcPr>
-          <w:p>
-            <w:pPr>
-              <w:pStyle w:val="ListParagraph"/>
-              <w:numPr>
-                <w:ilvl w:val="0"/>
-                <w:numId w:val="2"/>
-              </w:numPr>
-              <w:spacing w:after="30"/>
-            </w:pPr>
-            <w:r>
-              <w:rPr>
-                <w:rFonts w:ascii="Times New Roman" w:cs="Times New Roman" w:eastAsia="Times New Roman" w:hAnsi="Times New Roman"/>
-              </w:rPr>
-              <w:t xml:space="preserve">Bảng cầu nối toàn công ty không cần dòng này (tổng = 0).</w:t>
-            </w:r>
-          </w:p>
-          <w:p>
-            <w:pPr>
-              <w:pStyle w:val="ListParagraph"/>
-              <w:numPr>
-                <w:ilvl w:val="0"/>
-                <w:numId w:val="2"/>
-              </w:numPr>
-              <w:spacing w:after="30"/>
-            </w:pPr>
+            <w:tcW w:type="dxa" w:w="3300"/>
+            <w:tcBorders>
+              <w:top w:val="single" w:color="BFC9D9" w:sz="4"/>
+              <w:left w:val="single" w:color="BFC9D9" w:sz="4"/>
+              <w:bottom w:val="single" w:color="BFC9D9" w:sz="4"/>
+              <w:right w:val="single" w:color="BFC9D9" w:sz="4"/>
+            </w:tcBorders>
+            <w:tcMar>
+              <w:top w:type="dxa" w:w="70"/>
+              <w:left w:type="dxa" w:w="110"/>
+              <w:bottom w:type="dxa" w:w="70"/>
+              <w:right w:type="dxa" w:w="110"/>
+            </w:tcMar>
+          </w:tcPr>
+          <w:p>
+            <w:pPr>
+              <w:spacing w:after="40"/>
+              <w:jc w:val="left"/>
+            </w:pPr>
+            <w:r>
+              <w:rPr>
+                <w:rFonts w:ascii="Times New Roman" w:cs="Times New Roman" w:eastAsia="Times New Roman" w:hAnsi="Times New Roman"/>
+              </w:rPr>
+              <w:t xml:space="preserve">Bút toán ADJ-0925 (ADJ = Adjustment, bút toán điều chỉnh; 1.250 USD)</w:t>
+            </w:r>
+          </w:p>
+        </w:tc>
+        <w:tc>
+          <w:tcPr>
+            <w:tcW w:type="dxa" w:w="6338"/>
+            <w:tcBorders>
+              <w:top w:val="single" w:color="BFC9D9" w:sz="4"/>
+              <w:left w:val="single" w:color="BFC9D9" w:sz="4"/>
+              <w:bottom w:val="single" w:color="BFC9D9" w:sz="4"/>
+              <w:right w:val="single" w:color="BFC9D9" w:sz="4"/>
+            </w:tcBorders>
+            <w:tcMar>
+              <w:top w:type="dxa" w:w="70"/>
+              <w:left w:type="dxa" w:w="110"/>
+              <w:bottom w:type="dxa" w:w="70"/>
+              <w:right w:type="dxa" w:w="110"/>
+            </w:tcMar>
+          </w:tcPr>
+          <w:p>
+            <w:pPr>
+              <w:pStyle w:val="ListParagraph"/>
+              <w:numPr>
+                <w:ilvl w:val="0"/>
+                <w:numId w:val="2"/>
+              </w:numPr>
+              <w:spacing w:after="30"/>
+            </w:pPr>
+            <w:r>
+              <w:rPr>
+                <w:rFonts w:ascii="Times New Roman" w:cs="Times New Roman" w:eastAsia="Times New Roman" w:hAnsi="Times New Roman"/>
+              </w:rPr>
+              <w:t xml:space="preserve">Luôn để ở dòng </w:t>
+            </w:r>
             <w:r>
               <w:rPr>
                 <w:rFonts w:ascii="Times New Roman" w:cs="Times New Roman" w:eastAsia="Times New Roman" w:hAnsi="Times New Roman"/>
                 <w:b/>
                 <w:bCs/>
               </w:rPr>
-              <w:t xml:space="preserve">Bảng cầu nối theo kênh bắt buộc có dòng riêng</w:t>
+              <w:t xml:space="preserve">"Chưa giải thích được"</w:t>
+            </w:r>
+            <w:r>
+              <w:rPr>
+                <w:rFonts w:ascii="Times New Roman" w:cs="Times New Roman" w:eastAsia="Times New Roman" w:hAnsi="Times New Roman"/>
+              </w:rPr>
+              <w:t xml:space="preserve">.</w:t>
+            </w:r>
+          </w:p>
+          <w:p>
+            <w:pPr>
+              <w:pStyle w:val="ListParagraph"/>
+              <w:numPr>
+                <w:ilvl w:val="0"/>
+                <w:numId w:val="2"/>
+              </w:numPr>
+              <w:spacing w:after="30"/>
+            </w:pPr>
+            <w:r>
+              <w:rPr>
+                <w:rFonts w:ascii="Times New Roman" w:cs="Times New Roman" w:eastAsia="Times New Roman" w:hAnsi="Times New Roman"/>
+              </w:rPr>
+              <w:t xml:space="preserve">Không gộp vào dòng phí vận chuyển hay dòng làm tròn.</w:t>
+            </w:r>
+          </w:p>
+          <w:p>
+            <w:pPr>
+              <w:pStyle w:val="ListParagraph"/>
+              <w:numPr>
+                <w:ilvl w:val="0"/>
+                <w:numId w:val="2"/>
+              </w:numPr>
+              <w:spacing w:after="30"/>
+            </w:pPr>
+            <w:r>
+              <w:rPr>
+                <w:rFonts w:ascii="Times New Roman" w:cs="Times New Roman" w:eastAsia="Times New Roman" w:hAnsi="Times New Roman"/>
+              </w:rPr>
+              <w:t xml:space="preserve">Slide 32 gộp nó chung với phí vận chuyển dưới tên "bút toán tay", </w:t>
+            </w:r>
+            <w:r>
+              <w:rPr>
+                <w:rFonts w:ascii="Times New Roman" w:cs="Times New Roman" w:eastAsia="Times New Roman" w:hAnsi="Times New Roman"/>
+                <w:b/>
+                <w:bCs/>
+              </w:rPr>
+              <w:t xml:space="preserve">không chép theo cách đó</w:t>
             </w:r>
             <w:r>
               <w:rPr>
@@ -1843,7 +2005,7 @@
         </w:trPr>
         <w:tc>
           <w:tcPr>
-            <w:tcW w:type="dxa" w:w="3336"/>
+            <w:tcW w:type="dxa" w:w="3300"/>
             <w:tcBorders>
               <w:top w:val="single" w:color="BFC9D9" w:sz="4"/>
               <w:left w:val="single" w:color="BFC9D9" w:sz="4"/>
@@ -1867,20 +2029,111 @@
               <w:rPr>
                 <w:rFonts w:ascii="Times New Roman" w:cs="Times New Roman" w:eastAsia="Times New Roman" w:hAnsi="Times New Roman"/>
               </w:rPr>
+              <w:t xml:space="preserve">Bút toán MJ-RCL-2506 (MJ = Manual Journal, bút toán tay; RCL = Reclassification, phân loại lại): bút toán tay chuyển 3.480 USD từ cửa hàng NX019 sang online, tháng 6</w:t>
+            </w:r>
+          </w:p>
+        </w:tc>
+        <w:tc>
+          <w:tcPr>
+            <w:tcW w:type="dxa" w:w="6338"/>
+            <w:tcBorders>
+              <w:top w:val="single" w:color="BFC9D9" w:sz="4"/>
+              <w:left w:val="single" w:color="BFC9D9" w:sz="4"/>
+              <w:bottom w:val="single" w:color="BFC9D9" w:sz="4"/>
+              <w:right w:val="single" w:color="BFC9D9" w:sz="4"/>
+            </w:tcBorders>
+            <w:shd w:fill="F2F6FB" w:color="auto" w:val="clear"/>
+            <w:tcMar>
+              <w:top w:type="dxa" w:w="70"/>
+              <w:left w:type="dxa" w:w="110"/>
+              <w:bottom w:type="dxa" w:w="70"/>
+              <w:right w:type="dxa" w:w="110"/>
+            </w:tcMar>
+          </w:tcPr>
+          <w:p>
+            <w:pPr>
+              <w:pStyle w:val="ListParagraph"/>
+              <w:numPr>
+                <w:ilvl w:val="0"/>
+                <w:numId w:val="2"/>
+              </w:numPr>
+              <w:spacing w:after="30"/>
+            </w:pPr>
+            <w:r>
+              <w:rPr>
+                <w:rFonts w:ascii="Times New Roman" w:cs="Times New Roman" w:eastAsia="Times New Roman" w:hAnsi="Times New Roman"/>
+              </w:rPr>
+              <w:t xml:space="preserve">Bảng cầu nối toàn công ty không cần dòng này (tổng = 0).</w:t>
+            </w:r>
+          </w:p>
+          <w:p>
+            <w:pPr>
+              <w:pStyle w:val="ListParagraph"/>
+              <w:numPr>
+                <w:ilvl w:val="0"/>
+                <w:numId w:val="2"/>
+              </w:numPr>
+              <w:spacing w:after="30"/>
+            </w:pPr>
+            <w:r>
+              <w:rPr>
+                <w:rFonts w:ascii="Times New Roman" w:cs="Times New Roman" w:eastAsia="Times New Roman" w:hAnsi="Times New Roman"/>
+                <w:b/>
+                <w:bCs/>
+              </w:rPr>
+              <w:t xml:space="preserve">Bảng cầu nối theo kênh bắt buộc có dòng riêng</w:t>
+            </w:r>
+            <w:r>
+              <w:rPr>
+                <w:rFonts w:ascii="Times New Roman" w:cs="Times New Roman" w:eastAsia="Times New Roman" w:hAnsi="Times New Roman"/>
+              </w:rPr>
+              <w:t xml:space="preserve">.</w:t>
+            </w:r>
+          </w:p>
+        </w:tc>
+      </w:tr>
+      <w:tr>
+        <w:trPr>
+          <w:cantSplit w:val="false"/>
+        </w:trPr>
+        <w:tc>
+          <w:tcPr>
+            <w:tcW w:type="dxa" w:w="3300"/>
+            <w:tcBorders>
+              <w:top w:val="single" w:color="BFC9D9" w:sz="4"/>
+              <w:left w:val="single" w:color="BFC9D9" w:sz="4"/>
+              <w:bottom w:val="single" w:color="BFC9D9" w:sz="4"/>
+              <w:right w:val="single" w:color="BFC9D9" w:sz="4"/>
+            </w:tcBorders>
+            <w:tcMar>
+              <w:top w:type="dxa" w:w="70"/>
+              <w:left w:type="dxa" w:w="110"/>
+              <w:bottom w:type="dxa" w:w="70"/>
+              <w:right w:type="dxa" w:w="110"/>
+            </w:tcMar>
+          </w:tcPr>
+          <w:p>
+            <w:pPr>
+              <w:spacing w:after="40"/>
+              <w:jc w:val="left"/>
+            </w:pPr>
+            <w:r>
+              <w:rPr>
+                <w:rFonts w:ascii="Times New Roman" w:cs="Times New Roman" w:eastAsia="Times New Roman" w:hAnsi="Times New Roman"/>
+              </w:rPr>
               <w:t xml:space="preserve">Nhãn nguồn số liệu</w:t>
             </w:r>
           </w:p>
         </w:tc>
         <w:tc>
           <w:tcPr>
-            <w:tcW w:type="dxa" w:w="6302"/>
-            <w:tcBorders>
-              <w:top w:val="single" w:color="BFC9D9" w:sz="4"/>
-              <w:left w:val="single" w:color="BFC9D9" w:sz="4"/>
-              <w:bottom w:val="single" w:color="BFC9D9" w:sz="4"/>
-              <w:right w:val="single" w:color="BFC9D9" w:sz="4"/>
-            </w:tcBorders>
-            <w:shd w:fill="F2F6FB" w:color="auto" w:val="clear"/>
+            <w:tcW w:type="dxa" w:w="6338"/>
+            <w:tcBorders>
+              <w:top w:val="single" w:color="BFC9D9" w:sz="4"/>
+              <w:left w:val="single" w:color="BFC9D9" w:sz="4"/>
+              <w:bottom w:val="single" w:color="BFC9D9" w:sz="4"/>
+              <w:right w:val="single" w:color="BFC9D9" w:sz="4"/>
+            </w:tcBorders>
             <w:tcMar>
               <w:top w:type="dxa" w:w="70"/>
               <w:left w:type="dxa" w:w="110"/>
@@ -2111,7 +2364,7 @@
         <w:rPr>
           <w:rFonts w:ascii="Times New Roman" w:cs="Times New Roman" w:eastAsia="Times New Roman" w:hAnsi="Times New Roman"/>
         </w:rPr>
-        <w:t xml:space="preserve">2. Bảng số chuẩn để đối chiếu (sẽ lưu thành file </w:t>
+        <w:t xml:space="preserve">2. Bảng số chuẩn để đối chiếu (đã lưu thành file </w:t>
       </w:r>
       <w:r>
         <w:rPr>
@@ -2127,7 +2380,7 @@
         <w:rPr>
           <w:rFonts w:ascii="Times New Roman" w:cs="Times New Roman" w:eastAsia="Times New Roman" w:hAnsi="Times New Roman"/>
         </w:rPr>
-        <w:t xml:space="preserve"> khi bắt đầu làm)</w:t>
+        <w:t xml:space="preserve"> ngày 18/10)</w:t>
       </w:r>
       <w:bookmarkEnd w:id="1"/>
     </w:p>
@@ -2805,9 +3058,9 @@
         <w:tblLayout w:type="fixed"/>
       </w:tblPr>
       <w:tblGrid>
-        <w:gridCol w:w="5538"/>
-        <w:gridCol w:w="2557"/>
-        <w:gridCol w:w="1543"/>
+        <w:gridCol w:w="6243"/>
+        <w:gridCol w:w="2117"/>
+        <w:gridCol w:w="1278"/>
       </w:tblGrid>
       <w:tr>
         <w:trPr>
@@ -2815,7 +3068,7 @@
         </w:trPr>
         <w:tc>
           <w:tcPr>
-            <w:tcW w:type="dxa" w:w="5538"/>
+            <w:tcW w:type="dxa" w:w="6243"/>
             <w:tcBorders>
               <w:top w:val="single" w:color="BFC9D9" w:sz="4"/>
               <w:left w:val="single" w:color="BFC9D9" w:sz="4"/>
@@ -2849,7 +3102,7 @@
         </w:tc>
         <w:tc>
           <w:tcPr>
-            <w:tcW w:type="dxa" w:w="2557"/>
+            <w:tcW w:type="dxa" w:w="2117"/>
             <w:tcBorders>
               <w:top w:val="single" w:color="BFC9D9" w:sz="4"/>
               <w:left w:val="single" w:color="BFC9D9" w:sz="4"/>
@@ -2883,7 +3136,7 @@
         </w:tc>
         <w:tc>
           <w:tcPr>
-            <w:tcW w:type="dxa" w:w="1543"/>
+            <w:tcW w:type="dxa" w:w="1278"/>
             <w:tcBorders>
               <w:top w:val="single" w:color="BFC9D9" w:sz="4"/>
               <w:left w:val="single" w:color="BFC9D9" w:sz="4"/>
@@ -2922,7 +3175,7 @@
         </w:trPr>
         <w:tc>
           <w:tcPr>
-            <w:tcW w:type="dxa" w:w="5538"/>
+            <w:tcW w:type="dxa" w:w="6243"/>
             <w:tcBorders>
               <w:top w:val="single" w:color="BFC9D9" w:sz="4"/>
               <w:left w:val="single" w:color="BFC9D9" w:sz="4"/>
@@ -2951,7 +3204,7 @@
         </w:tc>
         <w:tc>
           <w:tcPr>
-            <w:tcW w:type="dxa" w:w="2557"/>
+            <w:tcW w:type="dxa" w:w="2117"/>
             <w:tcBorders>
               <w:top w:val="single" w:color="BFC9D9" w:sz="4"/>
               <w:left w:val="single" w:color="BFC9D9" w:sz="4"/>
@@ -2980,7 +3233,7 @@
         </w:tc>
         <w:tc>
           <w:tcPr>
-            <w:tcW w:type="dxa" w:w="1543"/>
+            <w:tcW w:type="dxa" w:w="1278"/>
             <w:tcBorders>
               <w:top w:val="single" w:color="BFC9D9" w:sz="4"/>
               <w:left w:val="single" w:color="BFC9D9" w:sz="4"/>
@@ -3003,7 +3256,7 @@
         </w:trPr>
         <w:tc>
           <w:tcPr>
-            <w:tcW w:type="dxa" w:w="5538"/>
+            <w:tcW w:type="dxa" w:w="6243"/>
             <w:tcBorders>
               <w:top w:val="single" w:color="BFC9D9" w:sz="4"/>
               <w:left w:val="single" w:color="BFC9D9" w:sz="4"/>
@@ -3033,7 +3286,7 @@
         </w:tc>
         <w:tc>
           <w:tcPr>
-            <w:tcW w:type="dxa" w:w="2557"/>
+            <w:tcW w:type="dxa" w:w="2117"/>
             <w:tcBorders>
               <w:top w:val="single" w:color="BFC9D9" w:sz="4"/>
               <w:left w:val="single" w:color="BFC9D9" w:sz="4"/>
@@ -3063,7 +3316,7 @@
         </w:tc>
         <w:tc>
           <w:tcPr>
-            <w:tcW w:type="dxa" w:w="1543"/>
+            <w:tcW w:type="dxa" w:w="1278"/>
             <w:tcBorders>
               <w:top w:val="single" w:color="BFC9D9" w:sz="4"/>
               <w:left w:val="single" w:color="BFC9D9" w:sz="4"/>
@@ -3098,7 +3351,7 @@
         </w:trPr>
         <w:tc>
           <w:tcPr>
-            <w:tcW w:type="dxa" w:w="5538"/>
+            <w:tcW w:type="dxa" w:w="6243"/>
             <w:tcBorders>
               <w:top w:val="single" w:color="BFC9D9" w:sz="4"/>
               <w:left w:val="single" w:color="BFC9D9" w:sz="4"/>
@@ -3159,7 +3412,7 @@
         </w:tc>
         <w:tc>
           <w:tcPr>
-            <w:tcW w:type="dxa" w:w="2557"/>
+            <w:tcW w:type="dxa" w:w="2117"/>
             <w:tcBorders>
               <w:top w:val="single" w:color="BFC9D9" w:sz="4"/>
               <w:left w:val="single" w:color="BFC9D9" w:sz="4"/>
@@ -3188,7 +3441,7 @@
         </w:tc>
         <w:tc>
           <w:tcPr>
-            <w:tcW w:type="dxa" w:w="1543"/>
+            <w:tcW w:type="dxa" w:w="1278"/>
             <w:tcBorders>
               <w:top w:val="single" w:color="BFC9D9" w:sz="4"/>
               <w:left w:val="single" w:color="BFC9D9" w:sz="4"/>
@@ -3222,7 +3475,7 @@
         </w:trPr>
         <w:tc>
           <w:tcPr>
-            <w:tcW w:type="dxa" w:w="5538"/>
+            <w:tcW w:type="dxa" w:w="6243"/>
             <w:tcBorders>
               <w:top w:val="single" w:color="BFC9D9" w:sz="4"/>
               <w:left w:val="single" w:color="BFC9D9" w:sz="4"/>
@@ -3284,7 +3537,7 @@
         </w:tc>
         <w:tc>
           <w:tcPr>
-            <w:tcW w:type="dxa" w:w="2557"/>
+            <w:tcW w:type="dxa" w:w="2117"/>
             <w:tcBorders>
               <w:top w:val="single" w:color="BFC9D9" w:sz="4"/>
               <w:left w:val="single" w:color="BFC9D9" w:sz="4"/>
@@ -3314,7 +3567,7 @@
         </w:tc>
         <w:tc>
           <w:tcPr>
-            <w:tcW w:type="dxa" w:w="1543"/>
+            <w:tcW w:type="dxa" w:w="1278"/>
             <w:tcBorders>
               <w:top w:val="single" w:color="BFC9D9" w:sz="4"/>
               <w:left w:val="single" w:color="BFC9D9" w:sz="4"/>
@@ -3349,7 +3602,7 @@
         </w:trPr>
         <w:tc>
           <w:tcPr>
-            <w:tcW w:type="dxa" w:w="5538"/>
+            <w:tcW w:type="dxa" w:w="6243"/>
             <w:tcBorders>
               <w:top w:val="single" w:color="BFC9D9" w:sz="4"/>
               <w:left w:val="single" w:color="BFC9D9" w:sz="4"/>
@@ -3394,7 +3647,7 @@
         </w:tc>
         <w:tc>
           <w:tcPr>
-            <w:tcW w:type="dxa" w:w="2557"/>
+            <w:tcW w:type="dxa" w:w="2117"/>
             <w:tcBorders>
               <w:top w:val="single" w:color="BFC9D9" w:sz="4"/>
               <w:left w:val="single" w:color="BFC9D9" w:sz="4"/>
@@ -3423,7 +3676,7 @@
         </w:tc>
         <w:tc>
           <w:tcPr>
-            <w:tcW w:type="dxa" w:w="1543"/>
+            <w:tcW w:type="dxa" w:w="1278"/>
             <w:tcBorders>
               <w:top w:val="single" w:color="BFC9D9" w:sz="4"/>
               <w:left w:val="single" w:color="BFC9D9" w:sz="4"/>
@@ -3457,7 +3710,7 @@
         </w:trPr>
         <w:tc>
           <w:tcPr>
-            <w:tcW w:type="dxa" w:w="5538"/>
+            <w:tcW w:type="dxa" w:w="6243"/>
             <w:tcBorders>
               <w:top w:val="single" w:color="BFC9D9" w:sz="4"/>
               <w:left w:val="single" w:color="BFC9D9" w:sz="4"/>
@@ -3487,7 +3740,7 @@
         </w:tc>
         <w:tc>
           <w:tcPr>
-            <w:tcW w:type="dxa" w:w="2557"/>
+            <w:tcW w:type="dxa" w:w="2117"/>
             <w:tcBorders>
               <w:top w:val="single" w:color="BFC9D9" w:sz="4"/>
               <w:left w:val="single" w:color="BFC9D9" w:sz="4"/>
@@ -3517,7 +3770,7 @@
         </w:tc>
         <w:tc>
           <w:tcPr>
-            <w:tcW w:type="dxa" w:w="1543"/>
+            <w:tcW w:type="dxa" w:w="1278"/>
             <w:tcBorders>
               <w:top w:val="single" w:color="BFC9D9" w:sz="4"/>
               <w:left w:val="single" w:color="BFC9D9" w:sz="4"/>
@@ -3552,7 +3805,7 @@
         </w:trPr>
         <w:tc>
           <w:tcPr>
-            <w:tcW w:type="dxa" w:w="5538"/>
+            <w:tcW w:type="dxa" w:w="6243"/>
             <w:tcBorders>
               <w:top w:val="single" w:color="BFC9D9" w:sz="4"/>
               <w:left w:val="single" w:color="BFC9D9" w:sz="4"/>
@@ -3581,7 +3834,7 @@
         </w:tc>
         <w:tc>
           <w:tcPr>
-            <w:tcW w:type="dxa" w:w="2557"/>
+            <w:tcW w:type="dxa" w:w="2117"/>
             <w:tcBorders>
               <w:top w:val="single" w:color="BFC9D9" w:sz="4"/>
               <w:left w:val="single" w:color="BFC9D9" w:sz="4"/>
@@ -3642,7 +3895,7 @@
         </w:tc>
         <w:tc>
           <w:tcPr>
-            <w:tcW w:type="dxa" w:w="1543"/>
+            <w:tcW w:type="dxa" w:w="1278"/>
             <w:tcBorders>
               <w:top w:val="single" w:color="BFC9D9" w:sz="4"/>
               <w:left w:val="single" w:color="BFC9D9" w:sz="4"/>
@@ -3676,7 +3929,7 @@
         </w:trPr>
         <w:tc>
           <w:tcPr>
-            <w:tcW w:type="dxa" w:w="5538"/>
+            <w:tcW w:type="dxa" w:w="6243"/>
             <w:tcBorders>
               <w:top w:val="single" w:color="BFC9D9" w:sz="4"/>
               <w:left w:val="single" w:color="BFC9D9" w:sz="4"/>
@@ -3706,7 +3959,7 @@
         </w:tc>
         <w:tc>
           <w:tcPr>
-            <w:tcW w:type="dxa" w:w="2557"/>
+            <w:tcW w:type="dxa" w:w="2117"/>
             <w:tcBorders>
               <w:top w:val="single" w:color="BFC9D9" w:sz="4"/>
               <w:left w:val="single" w:color="BFC9D9" w:sz="4"/>
@@ -3736,7 +3989,7 @@
         </w:tc>
         <w:tc>
           <w:tcPr>
-            <w:tcW w:type="dxa" w:w="1543"/>
+            <w:tcW w:type="dxa" w:w="1278"/>
             <w:tcBorders>
               <w:top w:val="single" w:color="BFC9D9" w:sz="4"/>
               <w:left w:val="single" w:color="BFC9D9" w:sz="4"/>
@@ -3771,7 +4024,7 @@
         </w:trPr>
         <w:tc>
           <w:tcPr>
-            <w:tcW w:type="dxa" w:w="5538"/>
+            <w:tcW w:type="dxa" w:w="6243"/>
             <w:tcBorders>
               <w:top w:val="single" w:color="BFC9D9" w:sz="4"/>
               <w:left w:val="single" w:color="BFC9D9" w:sz="4"/>
@@ -3816,7 +4069,7 @@
         </w:tc>
         <w:tc>
           <w:tcPr>
-            <w:tcW w:type="dxa" w:w="2557"/>
+            <w:tcW w:type="dxa" w:w="2117"/>
             <w:tcBorders>
               <w:top w:val="single" w:color="BFC9D9" w:sz="4"/>
               <w:left w:val="single" w:color="BFC9D9" w:sz="4"/>
@@ -3845,7 +4098,7 @@
         </w:tc>
         <w:tc>
           <w:tcPr>
-            <w:tcW w:type="dxa" w:w="1543"/>
+            <w:tcW w:type="dxa" w:w="1278"/>
             <w:tcBorders>
               <w:top w:val="single" w:color="BFC9D9" w:sz="4"/>
               <w:left w:val="single" w:color="BFC9D9" w:sz="4"/>
@@ -3879,7 +4132,7 @@
         </w:trPr>
         <w:tc>
           <w:tcPr>
-            <w:tcW w:type="dxa" w:w="5538"/>
+            <w:tcW w:type="dxa" w:w="6243"/>
             <w:tcBorders>
               <w:top w:val="single" w:color="BFC9D9" w:sz="4"/>
               <w:left w:val="single" w:color="BFC9D9" w:sz="4"/>
@@ -3906,10 +4159,26 @@
               <w:t xml:space="preserve">Tỷ giá</w:t>
             </w:r>
           </w:p>
-        </w:tc>
-        <w:tc>
-          <w:tcPr>
-            <w:tcW w:type="dxa" w:w="2557"/>
+          <w:p>
+            <w:pPr>
+              <w:pStyle w:val="ListParagraph"/>
+              <w:numPr>
+                <w:ilvl w:val="0"/>
+                <w:numId w:val="2"/>
+              </w:numPr>
+              <w:spacing w:after="30"/>
+            </w:pPr>
+            <w:r>
+              <w:rPr>
+                <w:rFonts w:ascii="Times New Roman" w:cs="Times New Roman" w:eastAsia="Times New Roman" w:hAnsi="Times New Roman"/>
+              </w:rPr>
+              <w:t xml:space="preserve">Sửa ngày 18/10, trước là −57.597,96 (xem mục 4)</w:t>
+            </w:r>
+          </w:p>
+        </w:tc>
+        <w:tc>
+          <w:tcPr>
+            <w:tcW w:type="dxa" w:w="2117"/>
             <w:tcBorders>
               <w:top w:val="single" w:color="BFC9D9" w:sz="4"/>
               <w:left w:val="single" w:color="BFC9D9" w:sz="4"/>
@@ -3933,13 +4202,13 @@
               <w:rPr>
                 <w:rFonts w:ascii="Times New Roman" w:cs="Times New Roman" w:eastAsia="Times New Roman" w:hAnsi="Times New Roman"/>
               </w:rPr>
-              <w:t xml:space="preserve">−57.597,96</w:t>
-            </w:r>
-          </w:p>
-        </w:tc>
-        <w:tc>
-          <w:tcPr>
-            <w:tcW w:type="dxa" w:w="1543"/>
+              <w:t xml:space="preserve">−57.598,01</w:t>
+            </w:r>
+          </w:p>
+        </w:tc>
+        <w:tc>
+          <w:tcPr>
+            <w:tcW w:type="dxa" w:w="1278"/>
             <w:tcBorders>
               <w:top w:val="single" w:color="BFC9D9" w:sz="4"/>
               <w:left w:val="single" w:color="BFC9D9" w:sz="4"/>
@@ -3974,7 +4243,7 @@
         </w:trPr>
         <w:tc>
           <w:tcPr>
-            <w:tcW w:type="dxa" w:w="5538"/>
+            <w:tcW w:type="dxa" w:w="6243"/>
             <w:tcBorders>
               <w:top w:val="single" w:color="BFC9D9" w:sz="4"/>
               <w:left w:val="single" w:color="BFC9D9" w:sz="4"/>
@@ -4000,10 +4269,58 @@
               <w:t xml:space="preserve">Làm tròn</w:t>
             </w:r>
           </w:p>
-        </w:tc>
-        <w:tc>
-          <w:tcPr>
-            <w:tcW w:type="dxa" w:w="2557"/>
+          <w:p>
+            <w:pPr>
+              <w:pStyle w:val="ListParagraph"/>
+              <w:numPr>
+                <w:ilvl w:val="0"/>
+                <w:numId w:val="2"/>
+              </w:numPr>
+              <w:spacing w:after="30"/>
+            </w:pPr>
+            <w:r>
+              <w:rPr>
+                <w:rFonts w:ascii="Times New Roman" w:cs="Times New Roman" w:eastAsia="Times New Roman" w:hAnsi="Times New Roman"/>
+              </w:rPr>
+              <w:t xml:space="preserve">Flash làm tròn từng dòng đến USD: +0,95</w:t>
+            </w:r>
+          </w:p>
+          <w:p>
+            <w:pPr>
+              <w:pStyle w:val="ListParagraph"/>
+              <w:numPr>
+                <w:ilvl w:val="0"/>
+                <w:numId w:val="2"/>
+              </w:numPr>
+              <w:spacing w:after="30"/>
+            </w:pPr>
+            <w:r>
+              <w:rPr>
+                <w:rFonts w:ascii="Times New Roman" w:cs="Times New Roman" w:eastAsia="Times New Roman" w:hAnsi="Times New Roman"/>
+              </w:rPr>
+              <w:t xml:space="preserve">Sổ cái làm tròn từng bút toán đến 2 chữ số: +0,05</w:t>
+            </w:r>
+          </w:p>
+          <w:p>
+            <w:pPr>
+              <w:pStyle w:val="ListParagraph"/>
+              <w:numPr>
+                <w:ilvl w:val="0"/>
+                <w:numId w:val="2"/>
+              </w:numPr>
+              <w:spacing w:after="30"/>
+            </w:pPr>
+            <w:r>
+              <w:rPr>
+                <w:rFonts w:ascii="Times New Roman" w:cs="Times New Roman" w:eastAsia="Times New Roman" w:hAnsi="Times New Roman"/>
+              </w:rPr>
+              <w:t xml:space="preserve">Sửa ngày 18/10, trước là +0,96; nay khớp slide 32 và 34 (1,01)</w:t>
+            </w:r>
+          </w:p>
+        </w:tc>
+        <w:tc>
+          <w:tcPr>
+            <w:tcW w:type="dxa" w:w="2117"/>
             <w:tcBorders>
               <w:top w:val="single" w:color="BFC9D9" w:sz="4"/>
               <w:left w:val="single" w:color="BFC9D9" w:sz="4"/>
@@ -4026,13 +4343,13 @@
               <w:rPr>
                 <w:rFonts w:ascii="Times New Roman" w:cs="Times New Roman" w:eastAsia="Times New Roman" w:hAnsi="Times New Roman"/>
               </w:rPr>
-              <w:t xml:space="preserve">+0,96</w:t>
-            </w:r>
-          </w:p>
-        </w:tc>
-        <w:tc>
-          <w:tcPr>
-            <w:tcW w:type="dxa" w:w="1543"/>
+              <w:t xml:space="preserve">+1,01</w:t>
+            </w:r>
+          </w:p>
+        </w:tc>
+        <w:tc>
+          <w:tcPr>
+            <w:tcW w:type="dxa" w:w="1278"/>
             <w:tcBorders>
               <w:top w:val="single" w:color="BFC9D9" w:sz="4"/>
               <w:left w:val="single" w:color="BFC9D9" w:sz="4"/>
@@ -4066,7 +4383,7 @@
         </w:trPr>
         <w:tc>
           <w:tcPr>
-            <w:tcW w:type="dxa" w:w="5538"/>
+            <w:tcW w:type="dxa" w:w="6243"/>
             <w:tcBorders>
               <w:top w:val="single" w:color="BFC9D9" w:sz="4"/>
               <w:left w:val="single" w:color="BFC9D9" w:sz="4"/>
@@ -4096,7 +4413,7 @@
         </w:tc>
         <w:tc>
           <w:tcPr>
-            <w:tcW w:type="dxa" w:w="2557"/>
+            <w:tcW w:type="dxa" w:w="2117"/>
             <w:tcBorders>
               <w:top w:val="single" w:color="BFC9D9" w:sz="4"/>
               <w:left w:val="single" w:color="BFC9D9" w:sz="4"/>
@@ -4126,7 +4443,7 @@
         </w:tc>
         <w:tc>
           <w:tcPr>
-            <w:tcW w:type="dxa" w:w="1543"/>
+            <w:tcW w:type="dxa" w:w="1278"/>
             <w:tcBorders>
               <w:top w:val="single" w:color="BFC9D9" w:sz="4"/>
               <w:left w:val="single" w:color="BFC9D9" w:sz="4"/>
@@ -4161,7 +4478,7 @@
         </w:trPr>
         <w:tc>
           <w:tcPr>
-            <w:tcW w:type="dxa" w:w="5538"/>
+            <w:tcW w:type="dxa" w:w="6243"/>
             <w:tcBorders>
               <w:top w:val="single" w:color="BFC9D9" w:sz="4"/>
               <w:left w:val="single" w:color="BFC9D9" w:sz="4"/>
@@ -4192,7 +4509,7 @@
         </w:tc>
         <w:tc>
           <w:tcPr>
-            <w:tcW w:type="dxa" w:w="2557"/>
+            <w:tcW w:type="dxa" w:w="2117"/>
             <w:tcBorders>
               <w:top w:val="single" w:color="BFC9D9" w:sz="4"/>
               <w:left w:val="single" w:color="BFC9D9" w:sz="4"/>
@@ -4223,7 +4540,7 @@
         </w:tc>
         <w:tc>
           <w:tcPr>
-            <w:tcW w:type="dxa" w:w="1543"/>
+            <w:tcW w:type="dxa" w:w="1278"/>
             <w:tcBorders>
               <w:top w:val="single" w:color="BFC9D9" w:sz="4"/>
               <w:left w:val="single" w:color="BFC9D9" w:sz="4"/>
@@ -5146,7 +5463,7 @@
               <w:rPr>
                 <w:rFonts w:ascii="Times New Roman" w:cs="Times New Roman" w:eastAsia="Times New Roman" w:hAnsi="Times New Roman"/>
               </w:rPr>
-              <w:t xml:space="preserve">Làm tròn: +0,96 cả năm, ≤ 5 USD/tháng</w:t>
+              <w:t xml:space="preserve">Làm tròn: +1,01 cả năm (Flash +0,95, sổ cái +0,05), ≤ 5 USD/tháng</w:t>
             </w:r>
           </w:p>
         </w:tc>
@@ -5278,6 +5595,554 @@
                 <w:rFonts w:ascii="Times New Roman" w:cs="Times New Roman" w:eastAsia="Times New Roman" w:hAnsi="Times New Roman"/>
               </w:rPr>
               <w:t xml:space="preserve">5 đơn bị trả trong tháng 12/2024, nằm ngoài năm đối soát.</w:t>
+            </w:r>
+          </w:p>
+        </w:tc>
+      </w:tr>
+    </w:tbl>
+    <w:p>
+      <w:pPr>
+        <w:spacing w:after="120"/>
+      </w:pPr>
+    </w:p>
+    <w:p>
+      <w:pPr>
+        <w:spacing w:before="120" w:after="120"/>
+      </w:pPr>
+    </w:p>
+    <w:p>
+      <w:pPr>
+        <w:pStyle w:val="Heading1"/>
+        <w:pageBreakBefore/>
+      </w:pPr>
+      <w:bookmarkStart w:name="muc_4" w:id="1"/>
+      <w:r>
+        <w:rPr>
+          <w:rFonts w:ascii="Times New Roman" w:cs="Times New Roman" w:eastAsia="Times New Roman" w:hAnsi="Times New Roman"/>
+        </w:rPr>
+        <w:t xml:space="preserve">4. Lịch sử thay đổi quy ước</w:t>
+      </w:r>
+      <w:bookmarkEnd w:id="1"/>
+    </w:p>
+    <w:p>
+      <w:pPr>
+        <w:spacing w:after="60"/>
+      </w:pPr>
+    </w:p>
+    <w:tbl>
+      <w:tblPr>
+        <w:tblW w:type="dxa" w:w="9638"/>
+        <w:tblBorders>
+          <w:top w:val="single" w:color="auto" w:sz="4"/>
+          <w:left w:val="single" w:color="auto" w:sz="4"/>
+          <w:bottom w:val="single" w:color="auto" w:sz="4"/>
+          <w:right w:val="single" w:color="auto" w:sz="4"/>
+          <w:insideH w:val="single" w:color="auto" w:sz="4"/>
+          <w:insideV w:val="single" w:color="auto" w:sz="4"/>
+        </w:tblBorders>
+        <w:tblLayout w:type="fixed"/>
+      </w:tblPr>
+      <w:tblGrid>
+        <w:gridCol w:w="1100"/>
+        <w:gridCol w:w="2112"/>
+        <w:gridCol w:w="3732"/>
+        <w:gridCol w:w="2694"/>
+      </w:tblGrid>
+      <w:tr>
+        <w:trPr>
+          <w:tblHeader/>
+        </w:trPr>
+        <w:tc>
+          <w:tcPr>
+            <w:tcW w:type="dxa" w:w="1100"/>
+            <w:tcBorders>
+              <w:top w:val="single" w:color="BFC9D9" w:sz="4"/>
+              <w:left w:val="single" w:color="BFC9D9" w:sz="4"/>
+              <w:bottom w:val="single" w:color="BFC9D9" w:sz="4"/>
+              <w:right w:val="single" w:color="BFC9D9" w:sz="4"/>
+            </w:tcBorders>
+            <w:shd w:fill="1F3864" w:color="auto" w:val="clear"/>
+            <w:tcMar>
+              <w:top w:type="dxa" w:w="80"/>
+              <w:left w:type="dxa" w:w="110"/>
+              <w:bottom w:type="dxa" w:w="80"/>
+              <w:right w:type="dxa" w:w="110"/>
+            </w:tcMar>
+            <w:vAlign w:val="center"/>
+          </w:tcPr>
+          <w:p>
+            <w:pPr>
+              <w:spacing w:after="40"/>
+              <w:jc w:val="left"/>
+            </w:pPr>
+            <w:r>
+              <w:rPr>
+                <w:rFonts w:ascii="Times New Roman" w:cs="Times New Roman" w:eastAsia="Times New Roman" w:hAnsi="Times New Roman"/>
+                <w:b/>
+                <w:bCs/>
+                <w:color w:val="FFFFFF"/>
+              </w:rPr>
+              <w:t xml:space="preserve">Ngày</w:t>
+            </w:r>
+          </w:p>
+        </w:tc>
+        <w:tc>
+          <w:tcPr>
+            <w:tcW w:type="dxa" w:w="2112"/>
+            <w:tcBorders>
+              <w:top w:val="single" w:color="BFC9D9" w:sz="4"/>
+              <w:left w:val="single" w:color="BFC9D9" w:sz="4"/>
+              <w:bottom w:val="single" w:color="BFC9D9" w:sz="4"/>
+              <w:right w:val="single" w:color="BFC9D9" w:sz="4"/>
+            </w:tcBorders>
+            <w:shd w:fill="1F3864" w:color="auto" w:val="clear"/>
+            <w:tcMar>
+              <w:top w:type="dxa" w:w="80"/>
+              <w:left w:type="dxa" w:w="110"/>
+              <w:bottom w:type="dxa" w:w="80"/>
+              <w:right w:type="dxa" w:w="110"/>
+            </w:tcMar>
+            <w:vAlign w:val="center"/>
+          </w:tcPr>
+          <w:p>
+            <w:pPr>
+              <w:spacing w:after="40"/>
+              <w:jc w:val="left"/>
+            </w:pPr>
+            <w:r>
+              <w:rPr>
+                <w:rFonts w:ascii="Times New Roman" w:cs="Times New Roman" w:eastAsia="Times New Roman" w:hAnsi="Times New Roman"/>
+                <w:b/>
+                <w:bCs/>
+                <w:color w:val="FFFFFF"/>
+              </w:rPr>
+              <w:t xml:space="preserve">Thay đổi</w:t>
+            </w:r>
+          </w:p>
+        </w:tc>
+        <w:tc>
+          <w:tcPr>
+            <w:tcW w:type="dxa" w:w="3732"/>
+            <w:tcBorders>
+              <w:top w:val="single" w:color="BFC9D9" w:sz="4"/>
+              <w:left w:val="single" w:color="BFC9D9" w:sz="4"/>
+              <w:bottom w:val="single" w:color="BFC9D9" w:sz="4"/>
+              <w:right w:val="single" w:color="BFC9D9" w:sz="4"/>
+            </w:tcBorders>
+            <w:shd w:fill="1F3864" w:color="auto" w:val="clear"/>
+            <w:tcMar>
+              <w:top w:type="dxa" w:w="80"/>
+              <w:left w:type="dxa" w:w="110"/>
+              <w:bottom w:type="dxa" w:w="80"/>
+              <w:right w:type="dxa" w:w="110"/>
+            </w:tcMar>
+            <w:vAlign w:val="center"/>
+          </w:tcPr>
+          <w:p>
+            <w:pPr>
+              <w:spacing w:after="40"/>
+              <w:jc w:val="left"/>
+            </w:pPr>
+            <w:r>
+              <w:rPr>
+                <w:rFonts w:ascii="Times New Roman" w:cs="Times New Roman" w:eastAsia="Times New Roman" w:hAnsi="Times New Roman"/>
+                <w:b/>
+                <w:bCs/>
+                <w:color w:val="FFFFFF"/>
+              </w:rPr>
+              <w:t xml:space="preserve">Lý do</w:t>
+            </w:r>
+          </w:p>
+        </w:tc>
+        <w:tc>
+          <w:tcPr>
+            <w:tcW w:type="dxa" w:w="2694"/>
+            <w:tcBorders>
+              <w:top w:val="single" w:color="BFC9D9" w:sz="4"/>
+              <w:left w:val="single" w:color="BFC9D9" w:sz="4"/>
+              <w:bottom w:val="single" w:color="BFC9D9" w:sz="4"/>
+              <w:right w:val="single" w:color="BFC9D9" w:sz="4"/>
+            </w:tcBorders>
+            <w:shd w:fill="1F3864" w:color="auto" w:val="clear"/>
+            <w:tcMar>
+              <w:top w:type="dxa" w:w="80"/>
+              <w:left w:type="dxa" w:w="110"/>
+              <w:bottom w:type="dxa" w:w="80"/>
+              <w:right w:type="dxa" w:w="110"/>
+            </w:tcMar>
+            <w:vAlign w:val="center"/>
+          </w:tcPr>
+          <w:p>
+            <w:pPr>
+              <w:spacing w:after="40"/>
+              <w:jc w:val="left"/>
+            </w:pPr>
+            <w:r>
+              <w:rPr>
+                <w:rFonts w:ascii="Times New Roman" w:cs="Times New Roman" w:eastAsia="Times New Roman" w:hAnsi="Times New Roman"/>
+                <w:b/>
+                <w:bCs/>
+                <w:color w:val="FFFFFF"/>
+              </w:rPr>
+              <w:t xml:space="preserve">Ảnh hưởng</w:t>
+            </w:r>
+          </w:p>
+        </w:tc>
+      </w:tr>
+      <w:tr>
+        <w:trPr>
+          <w:cantSplit w:val="false"/>
+        </w:trPr>
+        <w:tc>
+          <w:tcPr>
+            <w:tcW w:type="dxa" w:w="1100"/>
+            <w:tcBorders>
+              <w:top w:val="single" w:color="BFC9D9" w:sz="4"/>
+              <w:left w:val="single" w:color="BFC9D9" w:sz="4"/>
+              <w:bottom w:val="single" w:color="BFC9D9" w:sz="4"/>
+              <w:right w:val="single" w:color="BFC9D9" w:sz="4"/>
+            </w:tcBorders>
+            <w:tcMar>
+              <w:top w:type="dxa" w:w="70"/>
+              <w:left w:type="dxa" w:w="110"/>
+              <w:bottom w:type="dxa" w:w="70"/>
+              <w:right w:type="dxa" w:w="110"/>
+            </w:tcMar>
+          </w:tcPr>
+          <w:p>
+            <w:pPr>
+              <w:spacing w:after="40"/>
+              <w:jc w:val="left"/>
+            </w:pPr>
+            <w:r>
+              <w:rPr>
+                <w:rFonts w:ascii="Times New Roman" w:cs="Times New Roman" w:eastAsia="Times New Roman" w:hAnsi="Times New Roman"/>
+              </w:rPr>
+              <w:t xml:space="preserve">18/10</w:t>
+            </w:r>
+          </w:p>
+        </w:tc>
+        <w:tc>
+          <w:tcPr>
+            <w:tcW w:type="dxa" w:w="2112"/>
+            <w:tcBorders>
+              <w:top w:val="single" w:color="BFC9D9" w:sz="4"/>
+              <w:left w:val="single" w:color="BFC9D9" w:sz="4"/>
+              <w:bottom w:val="single" w:color="BFC9D9" w:sz="4"/>
+              <w:right w:val="single" w:color="BFC9D9" w:sz="4"/>
+            </w:tcBorders>
+            <w:tcMar>
+              <w:top w:type="dxa" w:w="70"/>
+              <w:left w:type="dxa" w:w="110"/>
+              <w:bottom w:type="dxa" w:w="70"/>
+              <w:right w:type="dxa" w:w="110"/>
+            </w:tcMar>
+          </w:tcPr>
+          <w:p>
+            <w:pPr>
+              <w:pStyle w:val="ListParagraph"/>
+              <w:numPr>
+                <w:ilvl w:val="0"/>
+                <w:numId w:val="2"/>
+              </w:numPr>
+              <w:spacing w:after="30"/>
+            </w:pPr>
+            <w:r>
+              <w:rPr>
+                <w:rFonts w:ascii="Times New Roman" w:cs="Times New Roman" w:eastAsia="Times New Roman" w:hAnsi="Times New Roman"/>
+              </w:rPr>
+              <w:t xml:space="preserve">Dòng tỷ giá cả năm: −57.597,96 → −57.598,01</w:t>
+            </w:r>
+          </w:p>
+          <w:p>
+            <w:pPr>
+              <w:pStyle w:val="ListParagraph"/>
+              <w:numPr>
+                <w:ilvl w:val="0"/>
+                <w:numId w:val="2"/>
+              </w:numPr>
+              <w:spacing w:after="30"/>
+            </w:pPr>
+            <w:r>
+              <w:rPr>
+                <w:rFonts w:ascii="Times New Roman" w:cs="Times New Roman" w:eastAsia="Times New Roman" w:hAnsi="Times New Roman"/>
+              </w:rPr>
+              <w:t xml:space="preserve">Dòng làm tròn cả năm: +0,96 → +1,01</w:t>
+            </w:r>
+          </w:p>
+        </w:tc>
+        <w:tc>
+          <w:tcPr>
+            <w:tcW w:type="dxa" w:w="3732"/>
+            <w:tcBorders>
+              <w:top w:val="single" w:color="BFC9D9" w:sz="4"/>
+              <w:left w:val="single" w:color="BFC9D9" w:sz="4"/>
+              <w:bottom w:val="single" w:color="BFC9D9" w:sz="4"/>
+              <w:right w:val="single" w:color="BFC9D9" w:sz="4"/>
+            </w:tcBorders>
+            <w:tcMar>
+              <w:top w:type="dxa" w:w="70"/>
+              <w:left w:type="dxa" w:w="110"/>
+              <w:bottom w:type="dxa" w:w="70"/>
+              <w:right w:type="dxa" w:w="110"/>
+            </w:tcMar>
+          </w:tcPr>
+          <w:p>
+            <w:pPr>
+              <w:pStyle w:val="ListParagraph"/>
+              <w:numPr>
+                <w:ilvl w:val="0"/>
+                <w:numId w:val="2"/>
+              </w:numPr>
+              <w:spacing w:after="30"/>
+            </w:pPr>
+            <w:r>
+              <w:rPr>
+                <w:rFonts w:ascii="Times New Roman" w:cs="Times New Roman" w:eastAsia="Times New Roman" w:hAnsi="Times New Roman"/>
+              </w:rPr>
+              <w:t xml:space="preserve">Bản cũ tính dòng tỷ giá từ số USD sổ cái </w:t>
+            </w:r>
+            <w:r>
+              <w:rPr>
+                <w:rFonts w:ascii="Times New Roman" w:cs="Times New Roman" w:eastAsia="Times New Roman" w:hAnsi="Times New Roman"/>
+                <w:b/>
+                <w:bCs/>
+              </w:rPr>
+              <w:t xml:space="preserve">đã làm tròn</w:t>
+            </w:r>
+            <w:r>
+              <w:rPr>
+                <w:rFonts w:ascii="Times New Roman" w:cs="Times New Roman" w:eastAsia="Times New Roman" w:hAnsi="Times New Roman"/>
+              </w:rPr>
+              <w:t xml:space="preserve"> từng bút toán, nên phần làm tròn của sổ cái (+0,05) lọt vào dòng tỷ giá</w:t>
+            </w:r>
+          </w:p>
+          <w:p>
+            <w:pPr>
+              <w:pStyle w:val="ListParagraph"/>
+              <w:numPr>
+                <w:ilvl w:val="0"/>
+                <w:numId w:val="2"/>
+              </w:numPr>
+              <w:spacing w:after="30"/>
+            </w:pPr>
+            <w:r>
+              <w:rPr>
+                <w:rFonts w:ascii="Times New Roman" w:cs="Times New Roman" w:eastAsia="Times New Roman" w:hAnsi="Times New Roman"/>
+              </w:rPr>
+              <w:t xml:space="preserve">Slide 34 định nghĩa: tỷ giá tính từ nội tệ ÷ tỷ giá (chưa làm tròn); làm tròn gồm cả phần của Flash và phần của sổ cái</w:t>
+            </w:r>
+          </w:p>
+          <w:p>
+            <w:pPr>
+              <w:pStyle w:val="ListParagraph"/>
+              <w:numPr>
+                <w:ilvl w:val="0"/>
+                <w:numId w:val="2"/>
+              </w:numPr>
+              <w:spacing w:after="30"/>
+            </w:pPr>
+            <w:r>
+              <w:rPr>
+                <w:rFonts w:ascii="Times New Roman" w:cs="Times New Roman" w:eastAsia="Times New Roman" w:hAnsi="Times New Roman"/>
+              </w:rPr>
+              <w:t xml:space="preserve">Bản mới khớp slide 32 và 34 (làm tròn 1,01), và khớp tháng 12 ở slide 36 (tỷ giá −27.080,93, làm tròn 0,67)</w:t>
+            </w:r>
+          </w:p>
+          <w:p>
+            <w:pPr>
+              <w:pStyle w:val="ListParagraph"/>
+              <w:numPr>
+                <w:ilvl w:val="0"/>
+                <w:numId w:val="2"/>
+              </w:numPr>
+              <w:spacing w:after="30"/>
+            </w:pPr>
+            <w:r>
+              <w:rPr>
+                <w:rFonts w:ascii="Times New Roman" w:cs="Times New Roman" w:eastAsia="Times New Roman" w:hAnsi="Times New Roman"/>
+              </w:rPr>
+              <w:t xml:space="preserve">Phát hiện khi rà soát plan </w:t>
+            </w:r>
+            <w:r>
+              <w:rPr>
+                <w:rFonts w:ascii="Times New Roman" w:cs="Times New Roman" w:eastAsia="Times New Roman" w:hAnsi="Times New Roman"/>
+                <w:color w:val="9C2B2B"/>
+                <w:sz w:val="24"/>
+                <w:szCs w:val="24"/>
+                <w:shd w:fill="EEEEEE" w:color="auto" w:val="clear"/>
+              </w:rPr>
+              <w:t xml:space="preserve">setup-baseline</w:t>
+            </w:r>
+          </w:p>
+        </w:tc>
+        <w:tc>
+          <w:tcPr>
+            <w:tcW w:type="dxa" w:w="2694"/>
+            <w:tcBorders>
+              <w:top w:val="single" w:color="BFC9D9" w:sz="4"/>
+              <w:left w:val="single" w:color="BFC9D9" w:sz="4"/>
+              <w:bottom w:val="single" w:color="BFC9D9" w:sz="4"/>
+              <w:right w:val="single" w:color="BFC9D9" w:sz="4"/>
+            </w:tcBorders>
+            <w:tcMar>
+              <w:top w:type="dxa" w:w="70"/>
+              <w:left w:type="dxa" w:w="110"/>
+              <w:bottom w:type="dxa" w:w="70"/>
+              <w:right w:type="dxa" w:w="110"/>
+            </w:tcMar>
+          </w:tcPr>
+          <w:p>
+            <w:pPr>
+              <w:spacing w:after="40"/>
+              <w:jc w:val="left"/>
+            </w:pPr>
+            <w:r>
+              <w:rPr>
+                <w:rFonts w:ascii="Times New Roman" w:cs="Times New Roman" w:eastAsia="Times New Roman" w:hAnsi="Times New Roman"/>
+              </w:rPr>
+              <w:t xml:space="preserve">Tổng hai dòng không đổi (−57.597,00), dòng kiểm tra vẫn về 0. Đã sửa </w:t>
+            </w:r>
+            <w:r>
+              <w:rPr>
+                <w:rFonts w:ascii="Times New Roman" w:cs="Times New Roman" w:eastAsia="Times New Roman" w:hAnsi="Times New Roman"/>
+                <w:color w:val="9C2B2B"/>
+                <w:sz w:val="24"/>
+                <w:szCs w:val="24"/>
+                <w:shd w:fill="EEEEEE" w:color="auto" w:val="clear"/>
+              </w:rPr>
+              <w:t xml:space="preserve">checks/numbers_of_record.csv</w:t>
+            </w:r>
+            <w:r>
+              <w:rPr>
+                <w:rFonts w:ascii="Times New Roman" w:cs="Times New Roman" w:eastAsia="Times New Roman" w:hAnsi="Times New Roman"/>
+              </w:rPr>
+              <w:t xml:space="preserve"> và câu hỏi mentor số 4</w:t>
+            </w:r>
+          </w:p>
+        </w:tc>
+      </w:tr>
+      <w:tr>
+        <w:trPr>
+          <w:cantSplit w:val="false"/>
+        </w:trPr>
+        <w:tc>
+          <w:tcPr>
+            <w:tcW w:type="dxa" w:w="1100"/>
+            <w:tcBorders>
+              <w:top w:val="single" w:color="BFC9D9" w:sz="4"/>
+              <w:left w:val="single" w:color="BFC9D9" w:sz="4"/>
+              <w:bottom w:val="single" w:color="BFC9D9" w:sz="4"/>
+              <w:right w:val="single" w:color="BFC9D9" w:sz="4"/>
+            </w:tcBorders>
+            <w:shd w:fill="F2F6FB" w:color="auto" w:val="clear"/>
+            <w:tcMar>
+              <w:top w:type="dxa" w:w="70"/>
+              <w:left w:type="dxa" w:w="110"/>
+              <w:bottom w:type="dxa" w:w="70"/>
+              <w:right w:type="dxa" w:w="110"/>
+            </w:tcMar>
+          </w:tcPr>
+          <w:p>
+            <w:pPr>
+              <w:spacing w:after="40"/>
+              <w:jc w:val="left"/>
+            </w:pPr>
+            <w:r>
+              <w:rPr>
+                <w:rFonts w:ascii="Times New Roman" w:cs="Times New Roman" w:eastAsia="Times New Roman" w:hAnsi="Times New Roman"/>
+              </w:rPr>
+              <w:t xml:space="preserve">18/10</w:t>
+            </w:r>
+          </w:p>
+        </w:tc>
+        <w:tc>
+          <w:tcPr>
+            <w:tcW w:type="dxa" w:w="2112"/>
+            <w:tcBorders>
+              <w:top w:val="single" w:color="BFC9D9" w:sz="4"/>
+              <w:left w:val="single" w:color="BFC9D9" w:sz="4"/>
+              <w:bottom w:val="single" w:color="BFC9D9" w:sz="4"/>
+              <w:right w:val="single" w:color="BFC9D9" w:sz="4"/>
+            </w:tcBorders>
+            <w:shd w:fill="F2F6FB" w:color="auto" w:val="clear"/>
+            <w:tcMar>
+              <w:top w:type="dxa" w:w="70"/>
+              <w:left w:type="dxa" w:w="110"/>
+              <w:bottom w:type="dxa" w:w="70"/>
+              <w:right w:type="dxa" w:w="110"/>
+            </w:tcMar>
+          </w:tcPr>
+          <w:p>
+            <w:pPr>
+              <w:spacing w:after="40"/>
+              <w:jc w:val="left"/>
+            </w:pPr>
+            <w:r>
+              <w:rPr>
+                <w:rFonts w:ascii="Times New Roman" w:cs="Times New Roman" w:eastAsia="Times New Roman" w:hAnsi="Times New Roman"/>
+              </w:rPr>
+              <w:t xml:space="preserve">Thêm ngoại lệ: lỗi chuyển dữ liệu đổi ra USD theo tỷ giá ngày của ngày ghi sổ</w:t>
+            </w:r>
+          </w:p>
+        </w:tc>
+        <w:tc>
+          <w:tcPr>
+            <w:tcW w:type="dxa" w:w="3732"/>
+            <w:tcBorders>
+              <w:top w:val="single" w:color="BFC9D9" w:sz="4"/>
+              <w:left w:val="single" w:color="BFC9D9" w:sz="4"/>
+              <w:bottom w:val="single" w:color="BFC9D9" w:sz="4"/>
+              <w:right w:val="single" w:color="BFC9D9" w:sz="4"/>
+            </w:tcBorders>
+            <w:shd w:fill="F2F6FB" w:color="auto" w:val="clear"/>
+            <w:tcMar>
+              <w:top w:type="dxa" w:w="70"/>
+              <w:left w:type="dxa" w:w="110"/>
+              <w:bottom w:type="dxa" w:w="70"/>
+              <w:right w:type="dxa" w:w="110"/>
+            </w:tcMar>
+          </w:tcPr>
+          <w:p>
+            <w:pPr>
+              <w:spacing w:after="40"/>
+              <w:jc w:val="left"/>
+            </w:pPr>
+            <w:r>
+              <w:rPr>
+                <w:rFonts w:ascii="Times New Roman" w:cs="Times New Roman" w:eastAsia="Times New Roman" w:hAnsi="Times New Roman"/>
+              </w:rPr>
+              <w:t xml:space="preserve">Bút toán sổ cái không ghi ngày bán nên không biết tỷ giá ngày bán</w:t>
+            </w:r>
+          </w:p>
+        </w:tc>
+        <w:tc>
+          <w:tcPr>
+            <w:tcW w:type="dxa" w:w="2694"/>
+            <w:tcBorders>
+              <w:top w:val="single" w:color="BFC9D9" w:sz="4"/>
+              <w:left w:val="single" w:color="BFC9D9" w:sz="4"/>
+              <w:bottom w:val="single" w:color="BFC9D9" w:sz="4"/>
+              <w:right w:val="single" w:color="BFC9D9" w:sz="4"/>
+            </w:tcBorders>
+            <w:shd w:fill="F2F6FB" w:color="auto" w:val="clear"/>
+            <w:tcMar>
+              <w:top w:type="dxa" w:w="70"/>
+              <w:left w:type="dxa" w:w="110"/>
+              <w:bottom w:type="dxa" w:w="70"/>
+              <w:right w:type="dxa" w:w="110"/>
+            </w:tcMar>
+          </w:tcPr>
+          <w:p>
+            <w:pPr>
+              <w:spacing w:after="40"/>
+              <w:jc w:val="left"/>
+            </w:pPr>
+            <w:r>
+              <w:rPr>
+                <w:rFonts w:ascii="Times New Roman" w:cs="Times New Roman" w:eastAsia="Times New Roman" w:hAnsi="Times New Roman"/>
+              </w:rPr>
+              <w:t xml:space="preserve">Không đổi số năm 2025 (NX057 dùng USD)</w:t>
             </w:r>
           </w:p>
         </w:tc>

</xml_diff>